<commit_message>
Deploying to gh-pages from @ Morrison-Lab/mds@4cacd9fa0ceda54381c4b750e68055049c8a3e50 🚀
</commit_message>
<xml_diff>
--- a/optimization-gradient-descent.docx
+++ b/optimization-gradient-descent.docx
@@ -15,10 +15,10 @@
         <w:pStyle w:val="Date"/>
       </w:pPr>
       <w:r>
-        <w:t xml:space="preserve">Last modified: 2026-10-30 21:18:12 (PDT)</w:t>
+        <w:t xml:space="preserve">Last modified: 2026-10-31 00:08:50 (PDT)</w:t>
       </w:r>
     </w:p>
-    <w:bookmarkStart w:id="143" w:name="sec-gradient-descent"/>
+    <w:bookmarkStart w:id="147" w:name="sec-gradient-descent"/>
     <w:p>
       <w:pPr>
         <w:pStyle w:val="Heading2"/>
@@ -20930,7 +20930,7 @@
               <w:rPr>
                 <w:rStyle w:val="CommentTok"/>
               </w:rPr>
-              <w:t xml:space="preserve">#&gt; [&lt;matplotlib.lines.Line2D object at 0x7f8b08db0190&gt;]</w:t>
+              <w:t xml:space="preserve">#&gt; [&lt;matplotlib.lines.Line2D object at 0x7f0244da4190&gt;]</w:t>
             </w:r>
             <w:r>
               <w:br/>
@@ -21494,7 +21494,7 @@
               <w:rPr>
                 <w:rStyle w:val="CommentTok"/>
               </w:rPr>
-              <w:t xml:space="preserve">#&gt; [&lt;matplotlib.lines.Line2D object at 0x7f8b08db02d0&gt;]</w:t>
+              <w:t xml:space="preserve">#&gt; [&lt;matplotlib.lines.Line2D object at 0x7f0244da42d0&gt;]</w:t>
             </w:r>
             <w:r>
               <w:br/>
@@ -21503,7 +21503,7 @@
               <w:rPr>
                 <w:rStyle w:val="CommentTok"/>
               </w:rPr>
-              <w:t xml:space="preserve">#&gt; [&lt;matplotlib.lines.Line2D object at 0x7f8b08db0410&gt;]</w:t>
+              <w:t xml:space="preserve">#&gt; [&lt;matplotlib.lines.Line2D object at 0x7f0244da4410&gt;]</w:t>
             </w:r>
             <w:r>
               <w:br/>
@@ -21512,7 +21512,7 @@
               <w:rPr>
                 <w:rStyle w:val="CommentTok"/>
               </w:rPr>
-              <w:t xml:space="preserve">#&gt; [&lt;matplotlib.lines.Line2D object at 0x7f8b08db0550&gt;]</w:t>
+              <w:t xml:space="preserve">#&gt; [&lt;matplotlib.lines.Line2D object at 0x7f0244da4550&gt;]</w:t>
             </w:r>
             <w:r>
               <w:br/>
@@ -21521,7 +21521,7 @@
               <w:rPr>
                 <w:rStyle w:val="CommentTok"/>
               </w:rPr>
-              <w:t xml:space="preserve">#&gt; [&lt;matplotlib.lines.Line2D object at 0x7f8b08db0690&gt;]</w:t>
+              <w:t xml:space="preserve">#&gt; [&lt;matplotlib.lines.Line2D object at 0x7f0244da4690&gt;]</w:t>
             </w:r>
             <w:r>
               <w:br/>
@@ -21530,7 +21530,7 @@
               <w:rPr>
                 <w:rStyle w:val="CommentTok"/>
               </w:rPr>
-              <w:t xml:space="preserve">#&gt; [&lt;matplotlib.lines.Line2D object at 0x7f8b08db07d0&gt;]</w:t>
+              <w:t xml:space="preserve">#&gt; [&lt;matplotlib.lines.Line2D object at 0x7f0244da47d0&gt;]</w:t>
             </w:r>
             <w:r>
               <w:br/>
@@ -21539,7 +21539,7 @@
               <w:rPr>
                 <w:rStyle w:val="CommentTok"/>
               </w:rPr>
-              <w:t xml:space="preserve">#&gt; [&lt;matplotlib.lines.Line2D object at 0x7f8b08db0910&gt;]</w:t>
+              <w:t xml:space="preserve">#&gt; [&lt;matplotlib.lines.Line2D object at 0x7f0244da4910&gt;]</w:t>
             </w:r>
             <w:r>
               <w:br/>
@@ -21653,7 +21653,7 @@
               <w:rPr>
                 <w:rStyle w:val="CommentTok"/>
               </w:rPr>
-              <w:t xml:space="preserve">#&gt; &lt;matplotlib.legend.Legend object at 0x7f8b08db0a50&gt;</w:t>
+              <w:t xml:space="preserve">#&gt; &lt;matplotlib.legend.Legend object at 0x7f0244da4a50&gt;</w:t>
             </w:r>
             <w:r>
               <w:br/>
@@ -27316,7 +27316,7 @@
               <w:rPr>
                 <w:rStyle w:val="CommentTok"/>
               </w:rPr>
-              <w:t xml:space="preserve">#&gt; [&lt;matplotlib.lines.Line2D object at 0x7f8b08c411d0&gt;]</w:t>
+              <w:t xml:space="preserve">#&gt; [&lt;matplotlib.lines.Line2D object at 0x7f0244c351d0&gt;]</w:t>
             </w:r>
             <w:r>
               <w:br/>
@@ -27463,7 +27463,7 @@
               <w:rPr>
                 <w:rStyle w:val="CommentTok"/>
               </w:rPr>
-              <w:t xml:space="preserve">#&gt; [&lt;matplotlib.lines.Line2D object at 0x7f8b08c41310&gt;]</w:t>
+              <w:t xml:space="preserve">#&gt; [&lt;matplotlib.lines.Line2D object at 0x7f0244c35310&gt;]</w:t>
             </w:r>
             <w:r>
               <w:br/>
@@ -35110,7 +35110,7 @@
               <w:rPr>
                 <w:rStyle w:val="CommentTok"/>
               </w:rPr>
-              <w:t xml:space="preserve">#&gt; [&lt;matplotlib.lines.Line2D object at 0x7f8b08a3c7d0&gt;]</w:t>
+              <w:t xml:space="preserve">#&gt; [&lt;matplotlib.lines.Line2D object at 0x7f0244a307d0&gt;]</w:t>
             </w:r>
             <w:r>
               <w:br/>
@@ -35176,7 +35176,7 @@
               <w:rPr>
                 <w:rStyle w:val="CommentTok"/>
               </w:rPr>
-              <w:t xml:space="preserve">#&gt; &lt;matplotlib.lines.Line2D object at 0x7f8b08a3c910&gt;</w:t>
+              <w:t xml:space="preserve">#&gt; &lt;matplotlib.lines.Line2D object at 0x7f0244a30910&gt;</w:t>
             </w:r>
             <w:r>
               <w:br/>
@@ -35242,7 +35242,7 @@
               <w:rPr>
                 <w:rStyle w:val="CommentTok"/>
               </w:rPr>
-              <w:t xml:space="preserve">#&gt; &lt;matplotlib.lines.Line2D object at 0x7f8b08a3ca50&gt;</w:t>
+              <w:t xml:space="preserve">#&gt; &lt;matplotlib.lines.Line2D object at 0x7f0244a30a50&gt;</w:t>
             </w:r>
             <w:r>
               <w:br/>
@@ -37383,8 +37383,3055 @@
       </w:r>
     </w:p>
     <w:bookmarkEnd w:id="131"/>
-    <w:bookmarkStart w:id="142" w:name="refs"/>
-    <w:bookmarkStart w:id="133" w:name="ref-wikipedia_gradient_descent"/>
+    <w:bookmarkStart w:id="132" w:name="def-momentum-coefficient"/>
+    <w:p>
+      <w:pPr>
+        <w:pStyle w:val="BodyText"/>
+      </w:pPr>
+      <w:r>
+        <w:rPr>
+          <w:b/>
+          <w:bCs/>
+        </w:rPr>
+        <w:t xml:space="preserve">Definition 13 (Momentum coefficient)</w:t>
+      </w:r>
+      <w:r>
+        <w:t xml:space="preserve"> </w:t>
+      </w:r>
+      <w:r>
+        <w:t xml:space="preserve">Let</w:t>
+      </w:r>
+      <w:r>
+        <w:t xml:space="preserve"> </w:t>
+      </w:r>
+      <w:r>
+        <w:t xml:space="preserve">$\mathord{\smash[b]{\underset{\raise.3ex\hbox{$\scriptstyle\sim$}}{g}}\vphantom{g}}^{(1)}, \mathord{\smash[b]{\underset{\raise.3ex\hbox{$\scriptstyle\sim$}}{g}}\vphantom{g}}^{(2)}, \ldots$</w:t>
+      </w:r>
+      <w:r>
+        <w:t xml:space="preserve"> </w:t>
+      </w:r>
+      <w:r>
+        <w:t xml:space="preserve">be vectors in</w:t>
+      </w:r>
+      <w:r>
+        <w:t xml:space="preserve"> </w:t>
+      </w:r>
+      <m:oMath>
+        <m:sSup>
+          <m:e>
+            <m:r>
+              <m:rPr>
+                <m:scr m:val="double-struck"/>
+                <m:sty m:val="p"/>
+              </m:rPr>
+              <m:t>R</m:t>
+            </m:r>
+          </m:e>
+          <m:sup>
+            <m:r>
+              <m:t>p</m:t>
+            </m:r>
+          </m:sup>
+        </m:sSup>
+      </m:oMath>
+      <w:r>
+        <w:t xml:space="preserve">,</w:t>
+      </w:r>
+      <w:r>
+        <w:t xml:space="preserve"> </w:t>
+      </w:r>
+      <w:r>
+        <w:t xml:space="preserve">and let</w:t>
+      </w:r>
+      <w:r>
+        <w:t xml:space="preserve"> </w:t>
+      </w:r>
+      <w:r>
+        <w:t xml:space="preserve">$\mathord{\smash[b]{\underset{\raise.3ex\hbox{$\scriptstyle\sim$}}{v}}\vphantom{v}}^{(t)}$</w:t>
+      </w:r>
+      <w:r>
+        <w:t xml:space="preserve"> </w:t>
+      </w:r>
+      <w:r>
+        <w:t xml:space="preserve">be a running</w:t>
+      </w:r>
+      <w:r>
+        <w:t xml:space="preserve"> </w:t>
+      </w:r>
+      <w:r>
+        <w:rPr>
+          <w:b/>
+          <w:bCs/>
+        </w:rPr>
+        <w:t xml:space="preserve">velocity</w:t>
+      </w:r>
+      <w:r>
+        <w:t xml:space="preserve"> </w:t>
+      </w:r>
+      <w:r>
+        <w:t xml:space="preserve">built from them.</w:t>
+      </w:r>
+      <w:r>
+        <w:t xml:space="preserve"> </w:t>
+      </w:r>
+      <w:r>
+        <w:t xml:space="preserve">The</w:t>
+      </w:r>
+      <w:r>
+        <w:t xml:space="preserve"> </w:t>
+      </w:r>
+      <w:r>
+        <w:rPr>
+          <w:b/>
+          <w:bCs/>
+        </w:rPr>
+        <w:t xml:space="preserve">momentum coefficient</w:t>
+      </w:r>
+      <w:r>
+        <w:t xml:space="preserve"> </w:t>
+      </w:r>
+      <m:oMath>
+        <m:r>
+          <m:t>β</m:t>
+        </m:r>
+        <m:r>
+          <m:rPr>
+            <m:sty m:val="p"/>
+          </m:rPr>
+          <m:t>∈</m:t>
+        </m:r>
+        <m:r>
+          <m:rPr>
+            <m:sty m:val="p"/>
+          </m:rPr>
+          <m:t>[</m:t>
+        </m:r>
+        <m:r>
+          <m:t>0</m:t>
+        </m:r>
+        <m:r>
+          <m:rPr>
+            <m:sty m:val="p"/>
+          </m:rPr>
+          <m:t>,</m:t>
+        </m:r>
+        <m:r>
+          <m:t>1</m:t>
+        </m:r>
+        <m:r>
+          <m:rPr>
+            <m:sty m:val="p"/>
+          </m:rPr>
+          <m:t>)</m:t>
+        </m:r>
+      </m:oMath>
+      <w:r>
+        <w:t xml:space="preserve"> </w:t>
+      </w:r>
+      <w:r>
+        <w:t xml:space="preserve">is the factor that multiplies the previous velocity in</w:t>
+      </w:r>
+    </w:p>
+    <w:p>
+      <w:pPr>
+        <w:pStyle w:val="BodyText"/>
+      </w:pPr>
+      <w:r>
+        <w:t xml:space="preserve">$$
+    \mathord{\smash[b]{\underset{\raise.3ex\hbox{$\scriptstyle\sim$}}{v}}\vphantom{v}}^{(t)} \stackrel{\text{def}}{=}\beta\,\mathord{\smash[b]{\underset{\raise.3ex\hbox{$\scriptstyle\sim$}}{v}}\vphantom{v}}^{(t-1)} + \mathord{\smash[b]{\underset{\raise.3ex\hbox{$\scriptstyle\sim$}}{g}}\vphantom{g}}^{(t)},
+    $$</w:t>
+      </w:r>
+    </w:p>
+    <w:p>
+      <w:pPr>
+        <w:pStyle w:val="FirstParagraph"/>
+      </w:pPr>
+      <w:r>
+        <w:t xml:space="preserve">for</w:t>
+      </w:r>
+      <w:r>
+        <w:t xml:space="preserve"> </w:t>
+      </w:r>
+      <m:oMath>
+        <m:r>
+          <m:t>t</m:t>
+        </m:r>
+        <m:r>
+          <m:rPr>
+            <m:sty m:val="p"/>
+          </m:rPr>
+          <m:t>=</m:t>
+        </m:r>
+        <m:r>
+          <m:t>1</m:t>
+        </m:r>
+        <m:r>
+          <m:rPr>
+            <m:sty m:val="p"/>
+          </m:rPr>
+          <m:t>,</m:t>
+        </m:r>
+        <m:r>
+          <m:t>2</m:t>
+        </m:r>
+        <m:r>
+          <m:rPr>
+            <m:sty m:val="p"/>
+          </m:rPr>
+          <m:t>,</m:t>
+        </m:r>
+        <m:r>
+          <m:rPr>
+            <m:sty m:val="p"/>
+          </m:rPr>
+          <m:t>…</m:t>
+        </m:r>
+      </m:oMath>
+      <w:r>
+        <w:t xml:space="preserve">, with</w:t>
+      </w:r>
+      <w:r>
+        <w:t xml:space="preserve"> </w:t>
+      </w:r>
+      <w:r>
+        <w:t xml:space="preserve">$\mathord{\smash[b]{\underset{\raise.3ex\hbox{$\scriptstyle\sim$}}{v}}\vphantom{v}}^{(0)} \stackrel{\text{def}}{=}\mathord{\smash[b]{\underset{\raise.3ex\hbox{$\scriptstyle\sim$}}{0}}\vphantom{0}}$</w:t>
+      </w:r>
+      <w:r>
+        <w:t xml:space="preserve">.</w:t>
+      </w:r>
+    </w:p>
+    <w:bookmarkEnd w:id="132"/>
+    <w:bookmarkStart w:id="133" w:name="exm-momentum-coefficient"/>
+    <w:p>
+      <w:pPr>
+        <w:pStyle w:val="BodyText"/>
+      </w:pPr>
+      <w:r>
+        <w:rPr>
+          <w:b/>
+          <w:bCs/>
+        </w:rPr>
+        <w:t xml:space="preserve">Example 17 (How far back the velocity remembers)</w:t>
+      </w:r>
+      <w:r>
+        <w:t xml:space="preserve"> </w:t>
+      </w:r>
+      <w:r>
+        <w:t xml:space="preserve">Unrolling the recursion, the vector</w:t>
+      </w:r>
+      <w:r>
+        <w:t xml:space="preserve"> </w:t>
+      </w:r>
+      <w:r>
+        <w:t xml:space="preserve">$\mathord{\smash[b]{\underset{\raise.3ex\hbox{$\scriptstyle\sim$}}{g}}\vphantom{g}}^{(t-k)}$</w:t>
+      </w:r>
+      <w:r>
+        <w:t xml:space="preserve"> </w:t>
+      </w:r>
+      <w:r>
+        <w:t xml:space="preserve">enters</w:t>
+      </w:r>
+      <w:r>
+        <w:t xml:space="preserve"> </w:t>
+      </w:r>
+      <w:r>
+        <w:t xml:space="preserve">$\mathord{\smash[b]{\underset{\raise.3ex\hbox{$\scriptstyle\sim$}}{v}}\vphantom{v}}^{(t)}$</w:t>
+      </w:r>
+      <w:r>
+        <w:t xml:space="preserve"> </w:t>
+      </w:r>
+      <w:r>
+        <w:t xml:space="preserve">with factor</w:t>
+      </w:r>
+      <w:r>
+        <w:t xml:space="preserve"> </w:t>
+      </w:r>
+      <m:oMath>
+        <m:sSup>
+          <m:e>
+            <m:r>
+              <m:t>β</m:t>
+            </m:r>
+          </m:e>
+          <m:sup>
+            <m:r>
+              <m:t>k</m:t>
+            </m:r>
+          </m:sup>
+        </m:sSup>
+      </m:oMath>
+      <w:r>
+        <w:t xml:space="preserve">, for</w:t>
+      </w:r>
+      <w:r>
+        <w:t xml:space="preserve"> </w:t>
+      </w:r>
+      <m:oMath>
+        <m:r>
+          <m:t>k</m:t>
+        </m:r>
+        <m:r>
+          <m:rPr>
+            <m:sty m:val="p"/>
+          </m:rPr>
+          <m:t>&lt;</m:t>
+        </m:r>
+        <m:r>
+          <m:t>t</m:t>
+        </m:r>
+      </m:oMath>
+      <w:r>
+        <w:t xml:space="preserve">.</w:t>
+      </w:r>
+      <w:r>
+        <w:t xml:space="preserve"> </w:t>
+      </w:r>
+      <w:r>
+        <w:t xml:space="preserve">These factors add up to at most</w:t>
+      </w:r>
+      <w:r>
+        <w:t xml:space="preserve"> </w:t>
+      </w:r>
+      <m:oMath>
+        <m:nary>
+          <m:naryPr>
+            <m:chr m:val="∑"/>
+            <m:limLoc m:val="undOvr"/>
+            <m:subHide m:val="off"/>
+            <m:supHide m:val="off"/>
+          </m:naryPr>
+          <m:sub>
+            <m:r>
+              <m:t>k</m:t>
+            </m:r>
+            <m:r>
+              <m:rPr>
+                <m:sty m:val="p"/>
+              </m:rPr>
+              <m:t>=</m:t>
+            </m:r>
+            <m:r>
+              <m:t>0</m:t>
+            </m:r>
+          </m:sub>
+          <m:sup>
+            <m:r>
+              <m:rPr>
+                <m:sty m:val="p"/>
+              </m:rPr>
+              <m:t>∞</m:t>
+            </m:r>
+          </m:sup>
+          <m:e>
+            <m:sSup>
+              <m:e>
+                <m:r>
+                  <m:t>β</m:t>
+                </m:r>
+              </m:e>
+              <m:sup>
+                <m:r>
+                  <m:t>k</m:t>
+                </m:r>
+              </m:sup>
+            </m:sSup>
+          </m:e>
+        </m:nary>
+        <m:r>
+          <m:rPr>
+            <m:sty m:val="p"/>
+          </m:rPr>
+          <m:t>=</m:t>
+        </m:r>
+        <m:r>
+          <m:t>1</m:t>
+        </m:r>
+        <m:r>
+          <m:rPr>
+            <m:sty m:val="p"/>
+          </m:rPr>
+          <m:t>/</m:t>
+        </m:r>
+        <m:r>
+          <m:rPr>
+            <m:sty m:val="p"/>
+          </m:rPr>
+          <m:t>(</m:t>
+        </m:r>
+        <m:r>
+          <m:t>1</m:t>
+        </m:r>
+        <m:r>
+          <m:rPr>
+            <m:sty m:val="p"/>
+          </m:rPr>
+          <m:t>−</m:t>
+        </m:r>
+        <m:r>
+          <m:t>β</m:t>
+        </m:r>
+        <m:r>
+          <m:rPr>
+            <m:sty m:val="p"/>
+          </m:rPr>
+          <m:t>)</m:t>
+        </m:r>
+      </m:oMath>
+      <w:r>
+        <w:t xml:space="preserve">.</w:t>
+      </w:r>
+      <w:r>
+        <w:t xml:space="preserve"> </w:t>
+      </w:r>
+      <w:r>
+        <w:t xml:space="preserve">As a rule of thumb, the</w:t>
+      </w:r>
+      <w:r>
+        <w:t xml:space="preserve"> </w:t>
+      </w:r>
+      <w:hyperlink w:anchor="def-momentum-coefficient">
+        <w:r>
+          <w:rPr>
+            <w:rStyle w:val="Hyperlink"/>
+          </w:rPr>
+          <w:t xml:space="preserve">velocity</w:t>
+        </w:r>
+      </w:hyperlink>
+      <w:r>
+        <w:t xml:space="preserve"> </w:t>
+      </w:r>
+      <w:r>
+        <w:t xml:space="preserve">is therefore dominated by the last</w:t>
+      </w:r>
+      <w:r>
+        <w:t xml:space="preserve"> </w:t>
+      </w:r>
+      <m:oMath>
+        <m:r>
+          <m:t>1</m:t>
+        </m:r>
+        <m:r>
+          <m:rPr>
+            <m:sty m:val="p"/>
+          </m:rPr>
+          <m:t>/</m:t>
+        </m:r>
+        <m:r>
+          <m:rPr>
+            <m:sty m:val="p"/>
+          </m:rPr>
+          <m:t>(</m:t>
+        </m:r>
+        <m:r>
+          <m:t>1</m:t>
+        </m:r>
+        <m:r>
+          <m:rPr>
+            <m:sty m:val="p"/>
+          </m:rPr>
+          <m:t>−</m:t>
+        </m:r>
+        <m:r>
+          <m:t>β</m:t>
+        </m:r>
+        <m:r>
+          <m:rPr>
+            <m:sty m:val="p"/>
+          </m:rPr>
+          <m:t>)</m:t>
+        </m:r>
+      </m:oMath>
+      <w:r>
+        <w:t xml:space="preserve"> </w:t>
+      </w:r>
+      <w:r>
+        <w:t xml:space="preserve">vectors.</w:t>
+      </w:r>
+    </w:p>
+    <w:p>
+      <w:pPr>
+        <w:pStyle w:val="Heading3"/>
+      </w:pPr>
+      <w:r>
+        <w:t xml:space="preserve">R</w:t>
+      </w:r>
+    </w:p>
+    <w:p>
+      <w:pPr>
+        <w:pStyle w:val="SourceCode"/>
+      </w:pPr>
+      <w:r>
+        <w:rPr>
+          <w:rStyle w:val="NormalTok"/>
+        </w:rPr>
+        <w:t xml:space="preserve">beta_mc </w:t>
+      </w:r>
+      <w:r>
+        <w:rPr>
+          <w:rStyle w:val="OtherTok"/>
+        </w:rPr>
+        <w:t xml:space="preserve">&lt;-</w:t>
+      </w:r>
+      <w:r>
+        <w:rPr>
+          <w:rStyle w:val="NormalTok"/>
+        </w:rPr>
+        <w:t xml:space="preserve"> </w:t>
+      </w:r>
+      <w:r>
+        <w:rPr>
+          <w:rStyle w:val="FunctionTok"/>
+        </w:rPr>
+        <w:t xml:space="preserve">c</w:t>
+      </w:r>
+      <w:r>
+        <w:rPr>
+          <w:rStyle w:val="NormalTok"/>
+        </w:rPr>
+        <w:t xml:space="preserve">(</w:t>
+      </w:r>
+      <w:r>
+        <w:rPr>
+          <w:rStyle w:val="DecValTok"/>
+        </w:rPr>
+        <w:t xml:space="preserve">0</w:t>
+      </w:r>
+      <w:r>
+        <w:rPr>
+          <w:rStyle w:val="NormalTok"/>
+        </w:rPr>
+        <w:t xml:space="preserve">, </w:t>
+      </w:r>
+      <w:r>
+        <w:rPr>
+          <w:rStyle w:val="FloatTok"/>
+        </w:rPr>
+        <w:t xml:space="preserve">0.5</w:t>
+      </w:r>
+      <w:r>
+        <w:rPr>
+          <w:rStyle w:val="NormalTok"/>
+        </w:rPr>
+        <w:t xml:space="preserve">, </w:t>
+      </w:r>
+      <w:r>
+        <w:rPr>
+          <w:rStyle w:val="FloatTok"/>
+        </w:rPr>
+        <w:t xml:space="preserve">0.9</w:t>
+      </w:r>
+      <w:r>
+        <w:rPr>
+          <w:rStyle w:val="NormalTok"/>
+        </w:rPr>
+        <w:t xml:space="preserve">, </w:t>
+      </w:r>
+      <w:r>
+        <w:rPr>
+          <w:rStyle w:val="FloatTok"/>
+        </w:rPr>
+        <w:t xml:space="preserve">0.99</w:t>
+      </w:r>
+      <w:r>
+        <w:rPr>
+          <w:rStyle w:val="NormalTok"/>
+        </w:rPr>
+        <w:t xml:space="preserve">)</w:t>
+      </w:r>
+      <w:r>
+        <w:br/>
+      </w:r>
+      <w:r>
+        <w:rPr>
+          <w:rStyle w:val="NormalTok"/>
+        </w:rPr>
+        <w:t xml:space="preserve">k_mc </w:t>
+      </w:r>
+      <w:r>
+        <w:rPr>
+          <w:rStyle w:val="OtherTok"/>
+        </w:rPr>
+        <w:t xml:space="preserve">&lt;-</w:t>
+      </w:r>
+      <w:r>
+        <w:rPr>
+          <w:rStyle w:val="NormalTok"/>
+        </w:rPr>
+        <w:t xml:space="preserve"> </w:t>
+      </w:r>
+      <w:r>
+        <w:rPr>
+          <w:rStyle w:val="DecValTok"/>
+        </w:rPr>
+        <w:t xml:space="preserve">10</w:t>
+      </w:r>
+      <w:r>
+        <w:br/>
+      </w:r>
+      <w:r>
+        <w:rPr>
+          <w:rStyle w:val="NormalTok"/>
+        </w:rPr>
+        <w:t xml:space="preserve">weight_mc </w:t>
+      </w:r>
+      <w:r>
+        <w:rPr>
+          <w:rStyle w:val="OtherTok"/>
+        </w:rPr>
+        <w:t xml:space="preserve">&lt;-</w:t>
+      </w:r>
+      <w:r>
+        <w:rPr>
+          <w:rStyle w:val="NormalTok"/>
+        </w:rPr>
+        <w:t xml:space="preserve"> beta_mc</w:t>
+      </w:r>
+      <w:r>
+        <w:rPr>
+          <w:rStyle w:val="SpecialCharTok"/>
+        </w:rPr>
+        <w:t xml:space="preserve">^</w:t>
+      </w:r>
+      <w:r>
+        <w:rPr>
+          <w:rStyle w:val="NormalTok"/>
+        </w:rPr>
+        <w:t xml:space="preserve">k_mc</w:t>
+      </w:r>
+      <w:r>
+        <w:br/>
+      </w:r>
+      <w:r>
+        <w:rPr>
+          <w:rStyle w:val="NormalTok"/>
+        </w:rPr>
+        <w:t xml:space="preserve">memory_mc </w:t>
+      </w:r>
+      <w:r>
+        <w:rPr>
+          <w:rStyle w:val="OtherTok"/>
+        </w:rPr>
+        <w:t xml:space="preserve">&lt;-</w:t>
+      </w:r>
+      <w:r>
+        <w:rPr>
+          <w:rStyle w:val="NormalTok"/>
+        </w:rPr>
+        <w:t xml:space="preserve"> </w:t>
+      </w:r>
+      <w:r>
+        <w:rPr>
+          <w:rStyle w:val="DecValTok"/>
+        </w:rPr>
+        <w:t xml:space="preserve">1</w:t>
+      </w:r>
+      <w:r>
+        <w:rPr>
+          <w:rStyle w:val="NormalTok"/>
+        </w:rPr>
+        <w:t xml:space="preserve"> </w:t>
+      </w:r>
+      <w:r>
+        <w:rPr>
+          <w:rStyle w:val="SpecialCharTok"/>
+        </w:rPr>
+        <w:t xml:space="preserve">/</w:t>
+      </w:r>
+      <w:r>
+        <w:rPr>
+          <w:rStyle w:val="NormalTok"/>
+        </w:rPr>
+        <w:t xml:space="preserve"> (</w:t>
+      </w:r>
+      <w:r>
+        <w:rPr>
+          <w:rStyle w:val="DecValTok"/>
+        </w:rPr>
+        <w:t xml:space="preserve">1</w:t>
+      </w:r>
+      <w:r>
+        <w:rPr>
+          <w:rStyle w:val="NormalTok"/>
+        </w:rPr>
+        <w:t xml:space="preserve"> </w:t>
+      </w:r>
+      <w:r>
+        <w:rPr>
+          <w:rStyle w:val="SpecialCharTok"/>
+        </w:rPr>
+        <w:t xml:space="preserve">-</w:t>
+      </w:r>
+      <w:r>
+        <w:rPr>
+          <w:rStyle w:val="NormalTok"/>
+        </w:rPr>
+        <w:t xml:space="preserve"> beta_mc)</w:t>
+      </w:r>
+      <w:r>
+        <w:br/>
+      </w:r>
+      <w:r>
+        <w:rPr>
+          <w:rStyle w:val="NormalTok"/>
+        </w:rPr>
+        <w:t xml:space="preserve">weight_rounded_mc </w:t>
+      </w:r>
+      <w:r>
+        <w:rPr>
+          <w:rStyle w:val="OtherTok"/>
+        </w:rPr>
+        <w:t xml:space="preserve">&lt;-</w:t>
+      </w:r>
+      <w:r>
+        <w:rPr>
+          <w:rStyle w:val="NormalTok"/>
+        </w:rPr>
+        <w:t xml:space="preserve"> </w:t>
+      </w:r>
+      <w:r>
+        <w:rPr>
+          <w:rStyle w:val="FunctionTok"/>
+        </w:rPr>
+        <w:t xml:space="preserve">signif</w:t>
+      </w:r>
+      <w:r>
+        <w:rPr>
+          <w:rStyle w:val="NormalTok"/>
+        </w:rPr>
+        <w:t xml:space="preserve">(weight_mc, </w:t>
+      </w:r>
+      <w:r>
+        <w:rPr>
+          <w:rStyle w:val="DecValTok"/>
+        </w:rPr>
+        <w:t xml:space="preserve">2</w:t>
+      </w:r>
+      <w:r>
+        <w:rPr>
+          <w:rStyle w:val="NormalTok"/>
+        </w:rPr>
+        <w:t xml:space="preserve">)</w:t>
+      </w:r>
+      <w:r>
+        <w:br/>
+      </w:r>
+      <w:r>
+        <w:rPr>
+          <w:rStyle w:val="CommentTok"/>
+        </w:rPr>
+        <w:t xml:space="preserve"># nolint start: undesirable_function_linter.</w:t>
+      </w:r>
+      <w:r>
+        <w:br/>
+      </w:r>
+      <w:r>
+        <w:rPr>
+          <w:rStyle w:val="FunctionTok"/>
+        </w:rPr>
+        <w:t xml:space="preserve">rbind</w:t>
+      </w:r>
+      <w:r>
+        <w:rPr>
+          <w:rStyle w:val="NormalTok"/>
+        </w:rPr>
+        <w:t xml:space="preserve">(</w:t>
+      </w:r>
+      <w:r>
+        <w:rPr>
+          <w:rStyle w:val="AttributeTok"/>
+        </w:rPr>
+        <w:t xml:space="preserve">beta =</w:t>
+      </w:r>
+      <w:r>
+        <w:rPr>
+          <w:rStyle w:val="NormalTok"/>
+        </w:rPr>
+        <w:t xml:space="preserve"> beta_mc, </w:t>
+      </w:r>
+      <w:r>
+        <w:rPr>
+          <w:rStyle w:val="AttributeTok"/>
+        </w:rPr>
+        <w:t xml:space="preserve">weight =</w:t>
+      </w:r>
+      <w:r>
+        <w:rPr>
+          <w:rStyle w:val="NormalTok"/>
+        </w:rPr>
+        <w:t xml:space="preserve"> weight_rounded_mc, </w:t>
+      </w:r>
+      <w:r>
+        <w:rPr>
+          <w:rStyle w:val="AttributeTok"/>
+        </w:rPr>
+        <w:t xml:space="preserve">memory =</w:t>
+      </w:r>
+      <w:r>
+        <w:rPr>
+          <w:rStyle w:val="NormalTok"/>
+        </w:rPr>
+        <w:t xml:space="preserve"> memory_mc)</w:t>
+      </w:r>
+      <w:r>
+        <w:br/>
+      </w:r>
+      <w:r>
+        <w:rPr>
+          <w:rStyle w:val="CommentTok"/>
+        </w:rPr>
+        <w:t xml:space="preserve">#&gt;        [,1]    [,2]  [,3]   [,4]</w:t>
+      </w:r>
+      <w:r>
+        <w:br/>
+      </w:r>
+      <w:r>
+        <w:rPr>
+          <w:rStyle w:val="CommentTok"/>
+        </w:rPr>
+        <w:t xml:space="preserve">#&gt; beta      0 0.50000  0.90   0.99</w:t>
+      </w:r>
+      <w:r>
+        <w:br/>
+      </w:r>
+      <w:r>
+        <w:rPr>
+          <w:rStyle w:val="CommentTok"/>
+        </w:rPr>
+        <w:t xml:space="preserve">#&gt; weight    0 0.00098  0.35   0.90</w:t>
+      </w:r>
+      <w:r>
+        <w:br/>
+      </w:r>
+      <w:r>
+        <w:rPr>
+          <w:rStyle w:val="CommentTok"/>
+        </w:rPr>
+        <w:t xml:space="preserve">#&gt; memory    1 2.00000 10.00 100.00</w:t>
+      </w:r>
+      <w:r>
+        <w:br/>
+      </w:r>
+      <w:r>
+        <w:rPr>
+          <w:rStyle w:val="CommentTok"/>
+        </w:rPr>
+        <w:t xml:space="preserve"># nolint end</w:t>
+      </w:r>
+    </w:p>
+    <w:p>
+      <w:pPr>
+        <w:pStyle w:val="Heading3"/>
+      </w:pPr>
+      <w:r>
+        <w:t xml:space="preserve">Python</w:t>
+      </w:r>
+    </w:p>
+    <w:p>
+      <w:pPr>
+        <w:pStyle w:val="SourceCode"/>
+      </w:pPr>
+      <w:r>
+        <w:rPr>
+          <w:rStyle w:val="NormalTok"/>
+        </w:rPr>
+        <w:t xml:space="preserve">beta_mc </w:t>
+      </w:r>
+      <w:r>
+        <w:rPr>
+          <w:rStyle w:val="OperatorTok"/>
+        </w:rPr>
+        <w:t xml:space="preserve">=</w:t>
+      </w:r>
+      <w:r>
+        <w:rPr>
+          <w:rStyle w:val="NormalTok"/>
+        </w:rPr>
+        <w:t xml:space="preserve"> [</w:t>
+      </w:r>
+      <w:r>
+        <w:rPr>
+          <w:rStyle w:val="DecValTok"/>
+        </w:rPr>
+        <w:t xml:space="preserve">0</w:t>
+      </w:r>
+      <w:r>
+        <w:rPr>
+          <w:rStyle w:val="NormalTok"/>
+        </w:rPr>
+        <w:t xml:space="preserve">, </w:t>
+      </w:r>
+      <w:r>
+        <w:rPr>
+          <w:rStyle w:val="FloatTok"/>
+        </w:rPr>
+        <w:t xml:space="preserve">0.5</w:t>
+      </w:r>
+      <w:r>
+        <w:rPr>
+          <w:rStyle w:val="NormalTok"/>
+        </w:rPr>
+        <w:t xml:space="preserve">, </w:t>
+      </w:r>
+      <w:r>
+        <w:rPr>
+          <w:rStyle w:val="FloatTok"/>
+        </w:rPr>
+        <w:t xml:space="preserve">0.9</w:t>
+      </w:r>
+      <w:r>
+        <w:rPr>
+          <w:rStyle w:val="NormalTok"/>
+        </w:rPr>
+        <w:t xml:space="preserve">, </w:t>
+      </w:r>
+      <w:r>
+        <w:rPr>
+          <w:rStyle w:val="FloatTok"/>
+        </w:rPr>
+        <w:t xml:space="preserve">0.99</w:t>
+      </w:r>
+      <w:r>
+        <w:rPr>
+          <w:rStyle w:val="NormalTok"/>
+        </w:rPr>
+        <w:t xml:space="preserve">]</w:t>
+      </w:r>
+      <w:r>
+        <w:br/>
+      </w:r>
+      <w:r>
+        <w:rPr>
+          <w:rStyle w:val="NormalTok"/>
+        </w:rPr>
+        <w:t xml:space="preserve">k_mc </w:t>
+      </w:r>
+      <w:r>
+        <w:rPr>
+          <w:rStyle w:val="OperatorTok"/>
+        </w:rPr>
+        <w:t xml:space="preserve">=</w:t>
+      </w:r>
+      <w:r>
+        <w:rPr>
+          <w:rStyle w:val="NormalTok"/>
+        </w:rPr>
+        <w:t xml:space="preserve"> </w:t>
+      </w:r>
+      <w:r>
+        <w:rPr>
+          <w:rStyle w:val="DecValTok"/>
+        </w:rPr>
+        <w:t xml:space="preserve">10</w:t>
+      </w:r>
+      <w:r>
+        <w:br/>
+      </w:r>
+      <w:r>
+        <w:rPr>
+          <w:rStyle w:val="ControlFlowTok"/>
+        </w:rPr>
+        <w:t xml:space="preserve">for</w:t>
+      </w:r>
+      <w:r>
+        <w:rPr>
+          <w:rStyle w:val="NormalTok"/>
+        </w:rPr>
+        <w:t xml:space="preserve"> b_mc </w:t>
+      </w:r>
+      <w:r>
+        <w:rPr>
+          <w:rStyle w:val="KeywordTok"/>
+        </w:rPr>
+        <w:t xml:space="preserve">in</w:t>
+      </w:r>
+      <w:r>
+        <w:rPr>
+          <w:rStyle w:val="NormalTok"/>
+        </w:rPr>
+        <w:t xml:space="preserve"> beta_mc:</w:t>
+      </w:r>
+      <w:r>
+        <w:br/>
+      </w:r>
+      <w:r>
+        <w:rPr>
+          <w:rStyle w:val="NormalTok"/>
+        </w:rPr>
+        <w:t xml:space="preserve">    </w:t>
+      </w:r>
+      <w:r>
+        <w:rPr>
+          <w:rStyle w:val="BuiltInTok"/>
+        </w:rPr>
+        <w:t xml:space="preserve">print</w:t>
+      </w:r>
+      <w:r>
+        <w:rPr>
+          <w:rStyle w:val="NormalTok"/>
+        </w:rPr>
+        <w:t xml:space="preserve">(b_mc, </w:t>
+      </w:r>
+      <w:r>
+        <w:rPr>
+          <w:rStyle w:val="BuiltInTok"/>
+        </w:rPr>
+        <w:t xml:space="preserve">float</w:t>
+      </w:r>
+      <w:r>
+        <w:rPr>
+          <w:rStyle w:val="NormalTok"/>
+        </w:rPr>
+        <w:t xml:space="preserve">(</w:t>
+      </w:r>
+      <w:r>
+        <w:rPr>
+          <w:rStyle w:val="SpecialStringTok"/>
+        </w:rPr>
+        <w:t xml:space="preserve">f"</w:t>
+      </w:r>
+      <w:r>
+        <w:rPr>
+          <w:rStyle w:val="SpecialCharTok"/>
+        </w:rPr>
+        <w:t xml:space="preserve">{</w:t>
+      </w:r>
+      <w:r>
+        <w:rPr>
+          <w:rStyle w:val="NormalTok"/>
+        </w:rPr>
+        <w:t xml:space="preserve">b_mc</w:t>
+      </w:r>
+      <w:r>
+        <w:rPr>
+          <w:rStyle w:val="OperatorTok"/>
+        </w:rPr>
+        <w:t xml:space="preserve">**</w:t>
+      </w:r>
+      <w:r>
+        <w:rPr>
+          <w:rStyle w:val="NormalTok"/>
+        </w:rPr>
+        <w:t xml:space="preserve">k_mc</w:t>
+      </w:r>
+      <w:r>
+        <w:rPr>
+          <w:rStyle w:val="SpecialCharTok"/>
+        </w:rPr>
+        <w:t xml:space="preserve">:.2g}</w:t>
+      </w:r>
+      <w:r>
+        <w:rPr>
+          <w:rStyle w:val="SpecialStringTok"/>
+        </w:rPr>
+        <w:t xml:space="preserve">"</w:t>
+      </w:r>
+      <w:r>
+        <w:rPr>
+          <w:rStyle w:val="NormalTok"/>
+        </w:rPr>
+        <w:t xml:space="preserve">), </w:t>
+      </w:r>
+      <w:r>
+        <w:rPr>
+          <w:rStyle w:val="BuiltInTok"/>
+        </w:rPr>
+        <w:t xml:space="preserve">round</w:t>
+      </w:r>
+      <w:r>
+        <w:rPr>
+          <w:rStyle w:val="NormalTok"/>
+        </w:rPr>
+        <w:t xml:space="preserve">(</w:t>
+      </w:r>
+      <w:r>
+        <w:rPr>
+          <w:rStyle w:val="DecValTok"/>
+        </w:rPr>
+        <w:t xml:space="preserve">1</w:t>
+      </w:r>
+      <w:r>
+        <w:rPr>
+          <w:rStyle w:val="NormalTok"/>
+        </w:rPr>
+        <w:t xml:space="preserve"> </w:t>
+      </w:r>
+      <w:r>
+        <w:rPr>
+          <w:rStyle w:val="OperatorTok"/>
+        </w:rPr>
+        <w:t xml:space="preserve">/</w:t>
+      </w:r>
+      <w:r>
+        <w:rPr>
+          <w:rStyle w:val="NormalTok"/>
+        </w:rPr>
+        <w:t xml:space="preserve"> (</w:t>
+      </w:r>
+      <w:r>
+        <w:rPr>
+          <w:rStyle w:val="DecValTok"/>
+        </w:rPr>
+        <w:t xml:space="preserve">1</w:t>
+      </w:r>
+      <w:r>
+        <w:rPr>
+          <w:rStyle w:val="NormalTok"/>
+        </w:rPr>
+        <w:t xml:space="preserve"> </w:t>
+      </w:r>
+      <w:r>
+        <w:rPr>
+          <w:rStyle w:val="OperatorTok"/>
+        </w:rPr>
+        <w:t xml:space="preserve">-</w:t>
+      </w:r>
+      <w:r>
+        <w:rPr>
+          <w:rStyle w:val="NormalTok"/>
+        </w:rPr>
+        <w:t xml:space="preserve"> b_mc)))</w:t>
+      </w:r>
+      <w:r>
+        <w:rPr>
+          <w:rStyle w:val="OperatorTok"/>
+        </w:rPr>
+        <w:t xml:space="preserve">;</w:t>
+      </w:r>
+      <w:r>
+        <w:br/>
+      </w:r>
+      <w:r>
+        <w:rPr>
+          <w:rStyle w:val="CommentTok"/>
+        </w:rPr>
+        <w:t xml:space="preserve">#&gt; 0 0.0 1</w:t>
+      </w:r>
+      <w:r>
+        <w:br/>
+      </w:r>
+      <w:r>
+        <w:rPr>
+          <w:rStyle w:val="CommentTok"/>
+        </w:rPr>
+        <w:t xml:space="preserve">#&gt; 0.5 0.00098 2</w:t>
+      </w:r>
+      <w:r>
+        <w:br/>
+      </w:r>
+      <w:r>
+        <w:rPr>
+          <w:rStyle w:val="CommentTok"/>
+        </w:rPr>
+        <w:t xml:space="preserve">#&gt; 0.9 0.35 10</w:t>
+      </w:r>
+      <w:r>
+        <w:br/>
+      </w:r>
+      <w:r>
+        <w:rPr>
+          <w:rStyle w:val="CommentTok"/>
+        </w:rPr>
+        <w:t xml:space="preserve">#&gt; 0.99 0.9 100</w:t>
+      </w:r>
+    </w:p>
+    <w:p>
+      <w:pPr>
+        <w:pStyle w:val="FirstParagraph"/>
+      </w:pPr>
+      <w:r>
+        <w:t xml:space="preserve">At</w:t>
+      </w:r>
+      <w:r>
+        <w:t xml:space="preserve"> </w:t>
+      </w:r>
+      <m:oMath>
+        <m:r>
+          <m:t>β</m:t>
+        </m:r>
+        <m:r>
+          <m:rPr>
+            <m:sty m:val="p"/>
+          </m:rPr>
+          <m:t>=</m:t>
+        </m:r>
+        <m:r>
+          <m:t>0</m:t>
+        </m:r>
+      </m:oMath>
+      <w:r>
+        <w:t xml:space="preserve"> </w:t>
+      </w:r>
+      <w:r>
+        <w:t xml:space="preserve">the</w:t>
+      </w:r>
+      <w:r>
+        <w:t xml:space="preserve"> </w:t>
+      </w:r>
+      <w:hyperlink w:anchor="def-momentum-coefficient">
+        <w:r>
+          <w:rPr>
+            <w:rStyle w:val="Hyperlink"/>
+          </w:rPr>
+          <w:t xml:space="preserve">velocity</w:t>
+        </w:r>
+      </w:hyperlink>
+      <w:r>
+        <w:t xml:space="preserve"> </w:t>
+      </w:r>
+      <w:r>
+        <w:t xml:space="preserve">is the current vector alone,</w:t>
+      </w:r>
+      <w:r>
+        <w:t xml:space="preserve"> </w:t>
+      </w:r>
+      <w:r>
+        <w:t xml:space="preserve">and at</w:t>
+      </w:r>
+      <w:r>
+        <w:t xml:space="preserve"> </w:t>
+      </w:r>
+      <m:oMath>
+        <m:r>
+          <m:t>β</m:t>
+        </m:r>
+        <m:r>
+          <m:rPr>
+            <m:sty m:val="p"/>
+          </m:rPr>
+          <m:t>=</m:t>
+        </m:r>
+        <m:r>
+          <m:t>0.99</m:t>
+        </m:r>
+      </m:oMath>
+      <w:r>
+        <w:t xml:space="preserve"> </w:t>
+      </w:r>
+      <w:r>
+        <w:t xml:space="preserve">it combines about 100 vectors.</w:t>
+      </w:r>
+    </w:p>
+    <w:bookmarkEnd w:id="133"/>
+    <w:bookmarkStart w:id="134" w:name="def-momentum"/>
+    <w:p>
+      <w:pPr>
+        <w:pStyle w:val="BodyText"/>
+      </w:pPr>
+      <w:r>
+        <w:rPr>
+          <w:b/>
+          <w:bCs/>
+        </w:rPr>
+        <w:t xml:space="preserve">Definition 14 (Momentum (heavy-ball method))</w:t>
+      </w:r>
+      <w:r>
+        <w:t xml:space="preserve"> </w:t>
+      </w:r>
+      <w:r>
+        <w:t xml:space="preserve">Let</w:t>
+      </w:r>
+      <w:r>
+        <w:t xml:space="preserve"> </w:t>
+      </w:r>
+      <m:oMath>
+        <m:r>
+          <m:t>f</m:t>
+        </m:r>
+        <m:r>
+          <m:rPr>
+            <m:sty m:val="p"/>
+          </m:rPr>
+          <m:t>:</m:t>
+        </m:r>
+        <m:sSup>
+          <m:e>
+            <m:r>
+              <m:rPr>
+                <m:scr m:val="double-struck"/>
+                <m:sty m:val="p"/>
+              </m:rPr>
+              <m:t>R</m:t>
+            </m:r>
+          </m:e>
+          <m:sup>
+            <m:r>
+              <m:t>p</m:t>
+            </m:r>
+          </m:sup>
+        </m:sSup>
+        <m:r>
+          <m:rPr>
+            <m:sty m:val="p"/>
+          </m:rPr>
+          <m:t>→</m:t>
+        </m:r>
+        <m:r>
+          <m:rPr>
+            <m:scr m:val="double-struck"/>
+            <m:sty m:val="p"/>
+          </m:rPr>
+          <m:t>R</m:t>
+        </m:r>
+      </m:oMath>
+      <w:r>
+        <w:t xml:space="preserve"> </w:t>
+      </w:r>
+      <w:r>
+        <w:t xml:space="preserve">have first</w:t>
+      </w:r>
+      <w:r>
+        <w:t xml:space="preserve"> </w:t>
+      </w:r>
+      <w:hyperlink r:id="rId13">
+        <w:r>
+          <w:rPr>
+            <w:rStyle w:val="Hyperlink"/>
+          </w:rPr>
+          <w:t xml:space="preserve">partial derivatives</w:t>
+        </w:r>
+      </w:hyperlink>
+      <w:r>
+        <w:t xml:space="preserve">,</w:t>
+      </w:r>
+      <w:r>
+        <w:t xml:space="preserve"> </w:t>
+      </w:r>
+      <w:r>
+        <w:t xml:space="preserve">let</w:t>
+      </w:r>
+      <w:r>
+        <w:t xml:space="preserve"> </w:t>
+      </w:r>
+      <w:r>
+        <w:t xml:space="preserve">$\mathord{\smash[b]{\underset{\raise.3ex\hbox{$\scriptstyle\sim$}}{x}}\vphantom{x}}^{(0)}$</w:t>
+      </w:r>
+      <w:r>
+        <w:t xml:space="preserve"> </w:t>
+      </w:r>
+      <w:r>
+        <w:t xml:space="preserve">be a starting point,</w:t>
+      </w:r>
+      <w:r>
+        <w:t xml:space="preserve"> </w:t>
+      </w:r>
+      <w:r>
+        <w:t xml:space="preserve">let</w:t>
+      </w:r>
+      <w:r>
+        <w:t xml:space="preserve"> </w:t>
+      </w:r>
+      <m:oMath>
+        <m:r>
+          <m:t>s</m:t>
+        </m:r>
+        <m:r>
+          <m:rPr>
+            <m:sty m:val="p"/>
+          </m:rPr>
+          <m:t>&gt;</m:t>
+        </m:r>
+        <m:r>
+          <m:t>0</m:t>
+        </m:r>
+      </m:oMath>
+      <w:r>
+        <w:t xml:space="preserve"> </w:t>
+      </w:r>
+      <w:r>
+        <w:t xml:space="preserve">be a</w:t>
+      </w:r>
+      <w:r>
+        <w:t xml:space="preserve"> </w:t>
+      </w:r>
+      <w:hyperlink w:anchor="def-gradient-descent">
+        <w:r>
+          <w:rPr>
+            <w:rStyle w:val="Hyperlink"/>
+          </w:rPr>
+          <w:t xml:space="preserve">step length</w:t>
+        </w:r>
+      </w:hyperlink>
+      <w:r>
+        <w:t xml:space="preserve">,</w:t>
+      </w:r>
+      <w:r>
+        <w:t xml:space="preserve"> </w:t>
+      </w:r>
+      <w:r>
+        <w:t xml:space="preserve">and let</w:t>
+      </w:r>
+      <w:r>
+        <w:t xml:space="preserve"> </w:t>
+      </w:r>
+      <m:oMath>
+        <m:r>
+          <m:t>β</m:t>
+        </m:r>
+        <m:r>
+          <m:rPr>
+            <m:sty m:val="p"/>
+          </m:rPr>
+          <m:t>∈</m:t>
+        </m:r>
+        <m:r>
+          <m:rPr>
+            <m:sty m:val="p"/>
+          </m:rPr>
+          <m:t>[</m:t>
+        </m:r>
+        <m:r>
+          <m:t>0</m:t>
+        </m:r>
+        <m:r>
+          <m:rPr>
+            <m:sty m:val="p"/>
+          </m:rPr>
+          <m:t>,</m:t>
+        </m:r>
+        <m:r>
+          <m:t>1</m:t>
+        </m:r>
+        <m:r>
+          <m:rPr>
+            <m:sty m:val="p"/>
+          </m:rPr>
+          <m:t>)</m:t>
+        </m:r>
+      </m:oMath>
+      <w:r>
+        <w:t xml:space="preserve"> </w:t>
+      </w:r>
+      <w:r>
+        <w:t xml:space="preserve">be a</w:t>
+      </w:r>
+      <w:r>
+        <w:t xml:space="preserve"> </w:t>
+      </w:r>
+      <w:hyperlink w:anchor="def-momentum-coefficient">
+        <w:r>
+          <w:rPr>
+            <w:rStyle w:val="Hyperlink"/>
+          </w:rPr>
+          <w:t xml:space="preserve">momentum coefficient</w:t>
+        </w:r>
+      </w:hyperlink>
+      <w:r>
+        <w:t xml:space="preserve">.</w:t>
+      </w:r>
+      <w:r>
+        <w:t xml:space="preserve"> </w:t>
+      </w:r>
+      <w:r>
+        <w:rPr>
+          <w:b/>
+          <w:bCs/>
+        </w:rPr>
+        <w:t xml:space="preserve">Momentum</w:t>
+      </w:r>
+      <w:r>
+        <w:t xml:space="preserve"> </w:t>
+      </w:r>
+      <w:r>
+        <w:t xml:space="preserve">(the</w:t>
+      </w:r>
+      <w:r>
+        <w:t xml:space="preserve"> </w:t>
+      </w:r>
+      <w:r>
+        <w:rPr>
+          <w:b/>
+          <w:bCs/>
+        </w:rPr>
+        <w:t xml:space="preserve">heavy-ball method</w:t>
+      </w:r>
+      <w:r>
+        <w:t xml:space="preserve">) updates, for</w:t>
+      </w:r>
+      <w:r>
+        <w:t xml:space="preserve"> </w:t>
+      </w:r>
+      <m:oMath>
+        <m:r>
+          <m:t>t</m:t>
+        </m:r>
+        <m:r>
+          <m:rPr>
+            <m:sty m:val="p"/>
+          </m:rPr>
+          <m:t>=</m:t>
+        </m:r>
+        <m:r>
+          <m:t>1</m:t>
+        </m:r>
+        <m:r>
+          <m:rPr>
+            <m:sty m:val="p"/>
+          </m:rPr>
+          <m:t>,</m:t>
+        </m:r>
+        <m:r>
+          <m:t>2</m:t>
+        </m:r>
+        <m:r>
+          <m:rPr>
+            <m:sty m:val="p"/>
+          </m:rPr>
+          <m:t>,</m:t>
+        </m:r>
+        <m:r>
+          <m:rPr>
+            <m:sty m:val="p"/>
+          </m:rPr>
+          <m:t>…</m:t>
+        </m:r>
+      </m:oMath>
+      <w:r>
+        <w:t xml:space="preserve">, by</w:t>
+      </w:r>
+    </w:p>
+    <w:p>
+      <w:pPr>
+        <w:pStyle w:val="BodyText"/>
+      </w:pPr>
+      <w:r>
+        <w:t xml:space="preserve">$$
+    \begin{aligned}
+    \mathord{\smash[b]{\underset{\raise.3ex\hbox{$\scriptstyle\sim$}}{v}}\vphantom{v}}^{(t)} &amp;\stackrel{\text{def}}{=}\beta\,\mathord{\smash[b]{\underset{\raise.3ex\hbox{$\scriptstyle\sim$}}{v}}\vphantom{v}}^{(t-1)} + \frac{\partial}{\partial \mathord{\smash[b]{\underset{\raise.3ex\hbox{$\scriptstyle\sim$}}{x}}\vphantom{x}}} f(\mathord{\smash[b]{\underset{\raise.3ex\hbox{$\scriptstyle\sim$}}{x}}\vphantom{x}}^{(t-1)}) \\
+    \mathord{\smash[b]{\underset{\raise.3ex\hbox{$\scriptstyle\sim$}}{x}}\vphantom{x}}^{(t)} &amp;\stackrel{\text{def}}{=}\mathord{\smash[b]{\underset{\raise.3ex\hbox{$\scriptstyle\sim$}}{x}}\vphantom{x}}^{(t-1)} - s\,\mathord{\smash[b]{\underset{\raise.3ex\hbox{$\scriptstyle\sim$}}{v}}\vphantom{v}}^{(t)},
+    \end{aligned}
+    $$</w:t>
+      </w:r>
+    </w:p>
+    <w:p>
+      <w:pPr>
+        <w:pStyle w:val="FirstParagraph"/>
+      </w:pPr>
+      <w:r>
+        <w:t xml:space="preserve">with</w:t>
+      </w:r>
+      <w:r>
+        <w:t xml:space="preserve"> </w:t>
+      </w:r>
+      <w:r>
+        <w:t xml:space="preserve">$\mathord{\smash[b]{\underset{\raise.3ex\hbox{$\scriptstyle\sim$}}{v}}\vphantom{v}}^{(0)} \stackrel{\text{def}}{=}\mathord{\smash[b]{\underset{\raise.3ex\hbox{$\scriptstyle\sim$}}{0}}\vphantom{0}}$</w:t>
+      </w:r>
+      <w:r>
+        <w:t xml:space="preserve">.</w:t>
+      </w:r>
+    </w:p>
+    <w:bookmarkEnd w:id="134"/>
+    <w:bookmarkStart w:id="135" w:name="exm-momentum"/>
+    <w:p>
+      <w:pPr>
+        <w:pStyle w:val="BodyText"/>
+      </w:pPr>
+      <w:r>
+        <w:rPr>
+          <w:b/>
+          <w:bCs/>
+        </w:rPr>
+        <w:t xml:space="preserve">Example 18 (Momentum on a one-dimensional quadratic)</w:t>
+      </w:r>
+      <w:r>
+        <w:t xml:space="preserve"> </w:t>
+      </w:r>
+      <w:r>
+        <w:t xml:space="preserve">Let</w:t>
+      </w:r>
+      <w:r>
+        <w:t xml:space="preserve"> </w:t>
+      </w:r>
+      <m:oMath>
+        <m:r>
+          <m:t>f</m:t>
+        </m:r>
+        <m:r>
+          <m:rPr>
+            <m:sty m:val="p"/>
+          </m:rPr>
+          <m:t>(</m:t>
+        </m:r>
+        <m:r>
+          <m:t>x</m:t>
+        </m:r>
+        <m:r>
+          <m:rPr>
+            <m:sty m:val="p"/>
+          </m:rPr>
+          <m:t>)</m:t>
+        </m:r>
+        <m:r>
+          <m:rPr>
+            <m:sty m:val="p"/>
+          </m:rPr>
+          <m:t>=</m:t>
+        </m:r>
+        <m:f>
+          <m:fPr>
+            <m:type m:val="lin"/>
+          </m:fPr>
+          <m:num>
+            <m:r>
+              <m:t>1</m:t>
+            </m:r>
+          </m:num>
+          <m:den>
+            <m:r>
+              <m:t>2</m:t>
+            </m:r>
+          </m:den>
+        </m:f>
+        <m:sSup>
+          <m:e>
+            <m:r>
+              <m:t>x</m:t>
+            </m:r>
+          </m:e>
+          <m:sup>
+            <m:r>
+              <m:t>2</m:t>
+            </m:r>
+          </m:sup>
+        </m:sSup>
+      </m:oMath>
+      <w:r>
+        <w:t xml:space="preserve">,</w:t>
+      </w:r>
+      <w:r>
+        <w:t xml:space="preserve"> </w:t>
+      </w:r>
+      <w:r>
+        <w:t xml:space="preserve">so</w:t>
+      </w:r>
+      <w:r>
+        <w:t xml:space="preserve"> </w:t>
+      </w:r>
+      <m:oMath>
+        <m:f>
+          <m:fPr>
+            <m:type m:val="bar"/>
+          </m:fPr>
+          <m:num>
+            <m:r>
+              <m:rPr>
+                <m:sty m:val="p"/>
+              </m:rPr>
+              <m:t>∂</m:t>
+            </m:r>
+          </m:num>
+          <m:den>
+            <m:r>
+              <m:rPr>
+                <m:sty m:val="p"/>
+              </m:rPr>
+              <m:t>∂</m:t>
+            </m:r>
+            <m:r>
+              <m:t>x</m:t>
+            </m:r>
+          </m:den>
+        </m:f>
+        <m:r>
+          <m:t>f</m:t>
+        </m:r>
+        <m:r>
+          <m:rPr>
+            <m:sty m:val="p"/>
+          </m:rPr>
+          <m:t>(</m:t>
+        </m:r>
+        <m:r>
+          <m:t>x</m:t>
+        </m:r>
+        <m:r>
+          <m:rPr>
+            <m:sty m:val="p"/>
+          </m:rPr>
+          <m:t>)</m:t>
+        </m:r>
+        <m:r>
+          <m:rPr>
+            <m:sty m:val="p"/>
+          </m:rPr>
+          <m:t>=</m:t>
+        </m:r>
+        <m:r>
+          <m:t>x</m:t>
+        </m:r>
+      </m:oMath>
+      <w:r>
+        <w:t xml:space="preserve">.</w:t>
+      </w:r>
+      <w:r>
+        <w:t xml:space="preserve"> </w:t>
+      </w:r>
+      <w:r>
+        <w:t xml:space="preserve">Start at</w:t>
+      </w:r>
+      <w:r>
+        <w:t xml:space="preserve"> </w:t>
+      </w:r>
+      <m:oMath>
+        <m:sSup>
+          <m:e>
+            <m:r>
+              <m:t>x</m:t>
+            </m:r>
+          </m:e>
+          <m:sup>
+            <m:r>
+              <m:rPr>
+                <m:sty m:val="p"/>
+              </m:rPr>
+              <m:t>(</m:t>
+            </m:r>
+            <m:r>
+              <m:t>0</m:t>
+            </m:r>
+            <m:r>
+              <m:rPr>
+                <m:sty m:val="p"/>
+              </m:rPr>
+              <m:t>)</m:t>
+            </m:r>
+          </m:sup>
+        </m:sSup>
+        <m:r>
+          <m:rPr>
+            <m:sty m:val="p"/>
+          </m:rPr>
+          <m:t>=</m:t>
+        </m:r>
+        <m:r>
+          <m:t>1</m:t>
+        </m:r>
+      </m:oMath>
+      <w:r>
+        <w:t xml:space="preserve"> </w:t>
+      </w:r>
+      <w:r>
+        <w:t xml:space="preserve">with</w:t>
+      </w:r>
+      <w:r>
+        <w:t xml:space="preserve"> </w:t>
+      </w:r>
+      <m:oMath>
+        <m:r>
+          <m:t>s</m:t>
+        </m:r>
+        <m:r>
+          <m:rPr>
+            <m:sty m:val="p"/>
+          </m:rPr>
+          <m:t>=</m:t>
+        </m:r>
+        <m:r>
+          <m:t>0.1</m:t>
+        </m:r>
+      </m:oMath>
+      <w:r>
+        <w:t xml:space="preserve">,</w:t>
+      </w:r>
+      <w:r>
+        <w:t xml:space="preserve"> </w:t>
+      </w:r>
+      <w:r>
+        <w:t xml:space="preserve">and take</w:t>
+      </w:r>
+      <w:r>
+        <w:t xml:space="preserve"> </w:t>
+      </w:r>
+      <m:oMath>
+        <m:r>
+          <m:t>20</m:t>
+        </m:r>
+      </m:oMath>
+      <w:r>
+        <w:t xml:space="preserve"> </w:t>
+      </w:r>
+      <w:r>
+        <w:t xml:space="preserve">updates with</w:t>
+      </w:r>
+      <w:r>
+        <w:t xml:space="preserve"> </w:t>
+      </w:r>
+      <m:oMath>
+        <m:r>
+          <m:t>β</m:t>
+        </m:r>
+        <m:r>
+          <m:rPr>
+            <m:sty m:val="p"/>
+          </m:rPr>
+          <m:t>=</m:t>
+        </m:r>
+        <m:r>
+          <m:t>0</m:t>
+        </m:r>
+      </m:oMath>
+      <w:r>
+        <w:t xml:space="preserve">, which is plain</w:t>
+      </w:r>
+      <w:r>
+        <w:t xml:space="preserve"> </w:t>
+      </w:r>
+      <w:hyperlink w:anchor="def-gradient-descent">
+        <w:r>
+          <w:rPr>
+            <w:rStyle w:val="Hyperlink"/>
+          </w:rPr>
+          <w:t xml:space="preserve">gradient descent</w:t>
+        </w:r>
+      </w:hyperlink>
+      <w:r>
+        <w:t xml:space="preserve">, and with</w:t>
+      </w:r>
+      <w:r>
+        <w:t xml:space="preserve"> </w:t>
+      </w:r>
+      <m:oMath>
+        <m:r>
+          <m:t>β</m:t>
+        </m:r>
+        <m:r>
+          <m:rPr>
+            <m:sty m:val="p"/>
+          </m:rPr>
+          <m:t>=</m:t>
+        </m:r>
+        <m:r>
+          <m:t>0.9</m:t>
+        </m:r>
+      </m:oMath>
+      <w:r>
+        <w:t xml:space="preserve">:</w:t>
+      </w:r>
+    </w:p>
+    <w:p>
+      <w:pPr>
+        <w:pStyle w:val="Heading3"/>
+      </w:pPr>
+      <w:r>
+        <w:t xml:space="preserve">R</w:t>
+      </w:r>
+    </w:p>
+    <w:p>
+      <w:pPr>
+        <w:pStyle w:val="SourceCode"/>
+      </w:pPr>
+      <w:r>
+        <w:rPr>
+          <w:rStyle w:val="NormalTok"/>
+        </w:rPr>
+        <w:t xml:space="preserve">x0_mo </w:t>
+      </w:r>
+      <w:r>
+        <w:rPr>
+          <w:rStyle w:val="OtherTok"/>
+        </w:rPr>
+        <w:t xml:space="preserve">&lt;-</w:t>
+      </w:r>
+      <w:r>
+        <w:rPr>
+          <w:rStyle w:val="NormalTok"/>
+        </w:rPr>
+        <w:t xml:space="preserve"> </w:t>
+      </w:r>
+      <w:r>
+        <w:rPr>
+          <w:rStyle w:val="DecValTok"/>
+        </w:rPr>
+        <w:t xml:space="preserve">1</w:t>
+      </w:r>
+      <w:r>
+        <w:br/>
+      </w:r>
+      <w:r>
+        <w:rPr>
+          <w:rStyle w:val="NormalTok"/>
+        </w:rPr>
+        <w:t xml:space="preserve">s_mo </w:t>
+      </w:r>
+      <w:r>
+        <w:rPr>
+          <w:rStyle w:val="OtherTok"/>
+        </w:rPr>
+        <w:t xml:space="preserve">&lt;-</w:t>
+      </w:r>
+      <w:r>
+        <w:rPr>
+          <w:rStyle w:val="NormalTok"/>
+        </w:rPr>
+        <w:t xml:space="preserve"> </w:t>
+      </w:r>
+      <w:r>
+        <w:rPr>
+          <w:rStyle w:val="FloatTok"/>
+        </w:rPr>
+        <w:t xml:space="preserve">0.1</w:t>
+      </w:r>
+      <w:r>
+        <w:br/>
+      </w:r>
+      <w:r>
+        <w:rPr>
+          <w:rStyle w:val="NormalTok"/>
+        </w:rPr>
+        <w:t xml:space="preserve">beta_mo </w:t>
+      </w:r>
+      <w:r>
+        <w:rPr>
+          <w:rStyle w:val="OtherTok"/>
+        </w:rPr>
+        <w:t xml:space="preserve">&lt;-</w:t>
+      </w:r>
+      <w:r>
+        <w:rPr>
+          <w:rStyle w:val="NormalTok"/>
+        </w:rPr>
+        <w:t xml:space="preserve"> </w:t>
+      </w:r>
+      <w:r>
+        <w:rPr>
+          <w:rStyle w:val="FunctionTok"/>
+        </w:rPr>
+        <w:t xml:space="preserve">c</w:t>
+      </w:r>
+      <w:r>
+        <w:rPr>
+          <w:rStyle w:val="NormalTok"/>
+        </w:rPr>
+        <w:t xml:space="preserve">(</w:t>
+      </w:r>
+      <w:r>
+        <w:rPr>
+          <w:rStyle w:val="AttributeTok"/>
+        </w:rPr>
+        <w:t xml:space="preserve">plain =</w:t>
+      </w:r>
+      <w:r>
+        <w:rPr>
+          <w:rStyle w:val="NormalTok"/>
+        </w:rPr>
+        <w:t xml:space="preserve"> </w:t>
+      </w:r>
+      <w:r>
+        <w:rPr>
+          <w:rStyle w:val="DecValTok"/>
+        </w:rPr>
+        <w:t xml:space="preserve">0</w:t>
+      </w:r>
+      <w:r>
+        <w:rPr>
+          <w:rStyle w:val="NormalTok"/>
+        </w:rPr>
+        <w:t xml:space="preserve">, </w:t>
+      </w:r>
+      <w:r>
+        <w:rPr>
+          <w:rStyle w:val="AttributeTok"/>
+        </w:rPr>
+        <w:t xml:space="preserve">momentum =</w:t>
+      </w:r>
+      <w:r>
+        <w:rPr>
+          <w:rStyle w:val="NormalTok"/>
+        </w:rPr>
+        <w:t xml:space="preserve"> </w:t>
+      </w:r>
+      <w:r>
+        <w:rPr>
+          <w:rStyle w:val="FloatTok"/>
+        </w:rPr>
+        <w:t xml:space="preserve">0.9</w:t>
+      </w:r>
+      <w:r>
+        <w:rPr>
+          <w:rStyle w:val="NormalTok"/>
+        </w:rPr>
+        <w:t xml:space="preserve">)</w:t>
+      </w:r>
+      <w:r>
+        <w:br/>
+      </w:r>
+      <w:r>
+        <w:rPr>
+          <w:rStyle w:val="NormalTok"/>
+        </w:rPr>
+        <w:t xml:space="preserve">n_mo </w:t>
+      </w:r>
+      <w:r>
+        <w:rPr>
+          <w:rStyle w:val="OtherTok"/>
+        </w:rPr>
+        <w:t xml:space="preserve">&lt;-</w:t>
+      </w:r>
+      <w:r>
+        <w:rPr>
+          <w:rStyle w:val="NormalTok"/>
+        </w:rPr>
+        <w:t xml:space="preserve"> </w:t>
+      </w:r>
+      <w:r>
+        <w:rPr>
+          <w:rStyle w:val="DecValTok"/>
+        </w:rPr>
+        <w:t xml:space="preserve">20</w:t>
+      </w:r>
+      <w:r>
+        <w:br/>
+      </w:r>
+      <w:r>
+        <w:rPr>
+          <w:rStyle w:val="NormalTok"/>
+        </w:rPr>
+        <w:t xml:space="preserve">x_mo </w:t>
+      </w:r>
+      <w:r>
+        <w:rPr>
+          <w:rStyle w:val="OtherTok"/>
+        </w:rPr>
+        <w:t xml:space="preserve">&lt;-</w:t>
+      </w:r>
+      <w:r>
+        <w:rPr>
+          <w:rStyle w:val="NormalTok"/>
+        </w:rPr>
+        <w:t xml:space="preserve"> </w:t>
+      </w:r>
+      <w:r>
+        <w:rPr>
+          <w:rStyle w:val="FunctionTok"/>
+        </w:rPr>
+        <w:t xml:space="preserve">rep</w:t>
+      </w:r>
+      <w:r>
+        <w:rPr>
+          <w:rStyle w:val="NormalTok"/>
+        </w:rPr>
+        <w:t xml:space="preserve">(x0_mo, </w:t>
+      </w:r>
+      <w:r>
+        <w:rPr>
+          <w:rStyle w:val="DecValTok"/>
+        </w:rPr>
+        <w:t xml:space="preserve">2</w:t>
+      </w:r>
+      <w:r>
+        <w:rPr>
+          <w:rStyle w:val="NormalTok"/>
+        </w:rPr>
+        <w:t xml:space="preserve">)</w:t>
+      </w:r>
+      <w:r>
+        <w:br/>
+      </w:r>
+      <w:r>
+        <w:rPr>
+          <w:rStyle w:val="NormalTok"/>
+        </w:rPr>
+        <w:t xml:space="preserve">v_mo </w:t>
+      </w:r>
+      <w:r>
+        <w:rPr>
+          <w:rStyle w:val="OtherTok"/>
+        </w:rPr>
+        <w:t xml:space="preserve">&lt;-</w:t>
+      </w:r>
+      <w:r>
+        <w:rPr>
+          <w:rStyle w:val="NormalTok"/>
+        </w:rPr>
+        <w:t xml:space="preserve"> </w:t>
+      </w:r>
+      <w:r>
+        <w:rPr>
+          <w:rStyle w:val="FunctionTok"/>
+        </w:rPr>
+        <w:t xml:space="preserve">c</w:t>
+      </w:r>
+      <w:r>
+        <w:rPr>
+          <w:rStyle w:val="NormalTok"/>
+        </w:rPr>
+        <w:t xml:space="preserve">(</w:t>
+      </w:r>
+      <w:r>
+        <w:rPr>
+          <w:rStyle w:val="DecValTok"/>
+        </w:rPr>
+        <w:t xml:space="preserve">0</w:t>
+      </w:r>
+      <w:r>
+        <w:rPr>
+          <w:rStyle w:val="NormalTok"/>
+        </w:rPr>
+        <w:t xml:space="preserve">, </w:t>
+      </w:r>
+      <w:r>
+        <w:rPr>
+          <w:rStyle w:val="DecValTok"/>
+        </w:rPr>
+        <w:t xml:space="preserve">0</w:t>
+      </w:r>
+      <w:r>
+        <w:rPr>
+          <w:rStyle w:val="NormalTok"/>
+        </w:rPr>
+        <w:t xml:space="preserve">)</w:t>
+      </w:r>
+      <w:r>
+        <w:br/>
+      </w:r>
+      <w:r>
+        <w:rPr>
+          <w:rStyle w:val="NormalTok"/>
+        </w:rPr>
+        <w:t xml:space="preserve">path_mo </w:t>
+      </w:r>
+      <w:r>
+        <w:rPr>
+          <w:rStyle w:val="OtherTok"/>
+        </w:rPr>
+        <w:t xml:space="preserve">&lt;-</w:t>
+      </w:r>
+      <w:r>
+        <w:rPr>
+          <w:rStyle w:val="NormalTok"/>
+        </w:rPr>
+        <w:t xml:space="preserve"> </w:t>
+      </w:r>
+      <w:r>
+        <w:rPr>
+          <w:rStyle w:val="FunctionTok"/>
+        </w:rPr>
+        <w:t xml:space="preserve">matrix</w:t>
+      </w:r>
+      <w:r>
+        <w:rPr>
+          <w:rStyle w:val="NormalTok"/>
+        </w:rPr>
+        <w:t xml:space="preserve">(</w:t>
+      </w:r>
+      <w:r>
+        <w:rPr>
+          <w:rStyle w:val="ConstantTok"/>
+        </w:rPr>
+        <w:t xml:space="preserve">NA_real_</w:t>
+      </w:r>
+      <w:r>
+        <w:rPr>
+          <w:rStyle w:val="NormalTok"/>
+        </w:rPr>
+        <w:t xml:space="preserve">, </w:t>
+      </w:r>
+      <w:r>
+        <w:rPr>
+          <w:rStyle w:val="AttributeTok"/>
+        </w:rPr>
+        <w:t xml:space="preserve">nrow =</w:t>
+      </w:r>
+      <w:r>
+        <w:rPr>
+          <w:rStyle w:val="NormalTok"/>
+        </w:rPr>
+        <w:t xml:space="preserve"> n_mo, </w:t>
+      </w:r>
+      <w:r>
+        <w:rPr>
+          <w:rStyle w:val="AttributeTok"/>
+        </w:rPr>
+        <w:t xml:space="preserve">ncol =</w:t>
+      </w:r>
+      <w:r>
+        <w:rPr>
+          <w:rStyle w:val="NormalTok"/>
+        </w:rPr>
+        <w:t xml:space="preserve"> </w:t>
+      </w:r>
+      <w:r>
+        <w:rPr>
+          <w:rStyle w:val="DecValTok"/>
+        </w:rPr>
+        <w:t xml:space="preserve">2</w:t>
+      </w:r>
+      <w:r>
+        <w:rPr>
+          <w:rStyle w:val="NormalTok"/>
+        </w:rPr>
+        <w:t xml:space="preserve">)</w:t>
+      </w:r>
+      <w:r>
+        <w:br/>
+      </w:r>
+      <w:r>
+        <w:rPr>
+          <w:rStyle w:val="ControlFlowTok"/>
+        </w:rPr>
+        <w:t xml:space="preserve">for</w:t>
+      </w:r>
+      <w:r>
+        <w:rPr>
+          <w:rStyle w:val="NormalTok"/>
+        </w:rPr>
+        <w:t xml:space="preserve"> (k_mo </w:t>
+      </w:r>
+      <w:r>
+        <w:rPr>
+          <w:rStyle w:val="ControlFlowTok"/>
+        </w:rPr>
+        <w:t xml:space="preserve">in</w:t>
+      </w:r>
+      <w:r>
+        <w:rPr>
+          <w:rStyle w:val="NormalTok"/>
+        </w:rPr>
+        <w:t xml:space="preserve"> </w:t>
+      </w:r>
+      <w:r>
+        <w:rPr>
+          <w:rStyle w:val="FunctionTok"/>
+        </w:rPr>
+        <w:t xml:space="preserve">seq_len</w:t>
+      </w:r>
+      <w:r>
+        <w:rPr>
+          <w:rStyle w:val="NormalTok"/>
+        </w:rPr>
+        <w:t xml:space="preserve">(n_mo)) {</w:t>
+      </w:r>
+      <w:r>
+        <w:br/>
+      </w:r>
+      <w:r>
+        <w:rPr>
+          <w:rStyle w:val="NormalTok"/>
+        </w:rPr>
+        <w:t xml:space="preserve">  v_mo </w:t>
+      </w:r>
+      <w:r>
+        <w:rPr>
+          <w:rStyle w:val="OtherTok"/>
+        </w:rPr>
+        <w:t xml:space="preserve">&lt;-</w:t>
+      </w:r>
+      <w:r>
+        <w:rPr>
+          <w:rStyle w:val="NormalTok"/>
+        </w:rPr>
+        <w:t xml:space="preserve"> beta_mo </w:t>
+      </w:r>
+      <w:r>
+        <w:rPr>
+          <w:rStyle w:val="SpecialCharTok"/>
+        </w:rPr>
+        <w:t xml:space="preserve">*</w:t>
+      </w:r>
+      <w:r>
+        <w:rPr>
+          <w:rStyle w:val="NormalTok"/>
+        </w:rPr>
+        <w:t xml:space="preserve"> v_mo </w:t>
+      </w:r>
+      <w:r>
+        <w:rPr>
+          <w:rStyle w:val="SpecialCharTok"/>
+        </w:rPr>
+        <w:t xml:space="preserve">+</w:t>
+      </w:r>
+      <w:r>
+        <w:rPr>
+          <w:rStyle w:val="NormalTok"/>
+        </w:rPr>
+        <w:t xml:space="preserve"> x_mo</w:t>
+      </w:r>
+      <w:r>
+        <w:br/>
+      </w:r>
+      <w:r>
+        <w:rPr>
+          <w:rStyle w:val="NormalTok"/>
+        </w:rPr>
+        <w:t xml:space="preserve">  x_mo </w:t>
+      </w:r>
+      <w:r>
+        <w:rPr>
+          <w:rStyle w:val="OtherTok"/>
+        </w:rPr>
+        <w:t xml:space="preserve">&lt;-</w:t>
+      </w:r>
+      <w:r>
+        <w:rPr>
+          <w:rStyle w:val="NormalTok"/>
+        </w:rPr>
+        <w:t xml:space="preserve"> x_mo </w:t>
+      </w:r>
+      <w:r>
+        <w:rPr>
+          <w:rStyle w:val="SpecialCharTok"/>
+        </w:rPr>
+        <w:t xml:space="preserve">-</w:t>
+      </w:r>
+      <w:r>
+        <w:rPr>
+          <w:rStyle w:val="NormalTok"/>
+        </w:rPr>
+        <w:t xml:space="preserve"> s_mo </w:t>
+      </w:r>
+      <w:r>
+        <w:rPr>
+          <w:rStyle w:val="SpecialCharTok"/>
+        </w:rPr>
+        <w:t xml:space="preserve">*</w:t>
+      </w:r>
+      <w:r>
+        <w:rPr>
+          <w:rStyle w:val="NormalTok"/>
+        </w:rPr>
+        <w:t xml:space="preserve"> v_mo</w:t>
+      </w:r>
+      <w:r>
+        <w:br/>
+      </w:r>
+      <w:r>
+        <w:rPr>
+          <w:rStyle w:val="NormalTok"/>
+        </w:rPr>
+        <w:t xml:space="preserve">  path_mo[k_mo, ] </w:t>
+      </w:r>
+      <w:r>
+        <w:rPr>
+          <w:rStyle w:val="OtherTok"/>
+        </w:rPr>
+        <w:t xml:space="preserve">&lt;-</w:t>
+      </w:r>
+      <w:r>
+        <w:rPr>
+          <w:rStyle w:val="NormalTok"/>
+        </w:rPr>
+        <w:t xml:space="preserve"> x_mo</w:t>
+      </w:r>
+      <w:r>
+        <w:br/>
+      </w:r>
+      <w:r>
+        <w:rPr>
+          <w:rStyle w:val="NormalTok"/>
+        </w:rPr>
+        <w:t xml:space="preserve">}</w:t>
+      </w:r>
+      <w:r>
+        <w:br/>
+      </w:r>
+      <w:r>
+        <w:rPr>
+          <w:rStyle w:val="NormalTok"/>
+        </w:rPr>
+        <w:t xml:space="preserve">last_mo </w:t>
+      </w:r>
+      <w:r>
+        <w:rPr>
+          <w:rStyle w:val="OtherTok"/>
+        </w:rPr>
+        <w:t xml:space="preserve">&lt;-</w:t>
+      </w:r>
+      <w:r>
+        <w:rPr>
+          <w:rStyle w:val="NormalTok"/>
+        </w:rPr>
+        <w:t xml:space="preserve"> path_mo[n_mo, ]</w:t>
+      </w:r>
+      <w:r>
+        <w:br/>
+      </w:r>
+      <w:r>
+        <w:rPr>
+          <w:rStyle w:val="NormalTok"/>
+        </w:rPr>
+        <w:t xml:space="preserve">lowest_mo </w:t>
+      </w:r>
+      <w:r>
+        <w:rPr>
+          <w:rStyle w:val="OtherTok"/>
+        </w:rPr>
+        <w:t xml:space="preserve">&lt;-</w:t>
+      </w:r>
+      <w:r>
+        <w:rPr>
+          <w:rStyle w:val="NormalTok"/>
+        </w:rPr>
+        <w:t xml:space="preserve"> </w:t>
+      </w:r>
+      <w:r>
+        <w:rPr>
+          <w:rStyle w:val="FunctionTok"/>
+        </w:rPr>
+        <w:t xml:space="preserve">apply</w:t>
+      </w:r>
+      <w:r>
+        <w:rPr>
+          <w:rStyle w:val="NormalTok"/>
+        </w:rPr>
+        <w:t xml:space="preserve">(path_mo, </w:t>
+      </w:r>
+      <w:r>
+        <w:rPr>
+          <w:rStyle w:val="DecValTok"/>
+        </w:rPr>
+        <w:t xml:space="preserve">2</w:t>
+      </w:r>
+      <w:r>
+        <w:rPr>
+          <w:rStyle w:val="NormalTok"/>
+        </w:rPr>
+        <w:t xml:space="preserve">, min)</w:t>
+      </w:r>
+      <w:r>
+        <w:br/>
+      </w:r>
+      <w:r>
+        <w:rPr>
+          <w:rStyle w:val="CommentTok"/>
+        </w:rPr>
+        <w:t xml:space="preserve"># nolint start: undesirable_function_linter.</w:t>
+      </w:r>
+      <w:r>
+        <w:br/>
+      </w:r>
+      <w:r>
+        <w:rPr>
+          <w:rStyle w:val="NormalTok"/>
+        </w:rPr>
+        <w:t xml:space="preserve">summary_mo </w:t>
+      </w:r>
+      <w:r>
+        <w:rPr>
+          <w:rStyle w:val="OtherTok"/>
+        </w:rPr>
+        <w:t xml:space="preserve">&lt;-</w:t>
+      </w:r>
+      <w:r>
+        <w:rPr>
+          <w:rStyle w:val="NormalTok"/>
+        </w:rPr>
+        <w:t xml:space="preserve"> </w:t>
+      </w:r>
+      <w:r>
+        <w:rPr>
+          <w:rStyle w:val="FunctionTok"/>
+        </w:rPr>
+        <w:t xml:space="preserve">rbind</w:t>
+      </w:r>
+      <w:r>
+        <w:rPr>
+          <w:rStyle w:val="NormalTok"/>
+        </w:rPr>
+        <w:t xml:space="preserve">(</w:t>
+      </w:r>
+      <w:r>
+        <w:rPr>
+          <w:rStyle w:val="AttributeTok"/>
+        </w:rPr>
+        <w:t xml:space="preserve">last =</w:t>
+      </w:r>
+      <w:r>
+        <w:rPr>
+          <w:rStyle w:val="NormalTok"/>
+        </w:rPr>
+        <w:t xml:space="preserve"> last_mo, </w:t>
+      </w:r>
+      <w:r>
+        <w:rPr>
+          <w:rStyle w:val="AttributeTok"/>
+        </w:rPr>
+        <w:t xml:space="preserve">lowest =</w:t>
+      </w:r>
+      <w:r>
+        <w:rPr>
+          <w:rStyle w:val="NormalTok"/>
+        </w:rPr>
+        <w:t xml:space="preserve"> lowest_mo)</w:t>
+      </w:r>
+      <w:r>
+        <w:br/>
+      </w:r>
+      <w:r>
+        <w:rPr>
+          <w:rStyle w:val="CommentTok"/>
+        </w:rPr>
+        <w:t xml:space="preserve"># nolint end</w:t>
+      </w:r>
+      <w:r>
+        <w:br/>
+      </w:r>
+      <w:r>
+        <w:rPr>
+          <w:rStyle w:val="FunctionTok"/>
+        </w:rPr>
+        <w:t xml:space="preserve">round</w:t>
+      </w:r>
+      <w:r>
+        <w:rPr>
+          <w:rStyle w:val="NormalTok"/>
+        </w:rPr>
+        <w:t xml:space="preserve">(summary_mo, </w:t>
+      </w:r>
+      <w:r>
+        <w:rPr>
+          <w:rStyle w:val="DecValTok"/>
+        </w:rPr>
+        <w:t xml:space="preserve">4</w:t>
+      </w:r>
+      <w:r>
+        <w:rPr>
+          <w:rStyle w:val="NormalTok"/>
+        </w:rPr>
+        <w:t xml:space="preserve">)</w:t>
+      </w:r>
+      <w:r>
+        <w:br/>
+      </w:r>
+      <w:r>
+        <w:rPr>
+          <w:rStyle w:val="CommentTok"/>
+        </w:rPr>
+        <w:t xml:space="preserve">#&gt;          [,1]    [,2]</w:t>
+      </w:r>
+      <w:r>
+        <w:br/>
+      </w:r>
+      <w:r>
+        <w:rPr>
+          <w:rStyle w:val="CommentTok"/>
+        </w:rPr>
+        <w:t xml:space="preserve">#&gt; last   0.1216  0.3447</w:t>
+      </w:r>
+      <w:r>
+        <w:br/>
+      </w:r>
+      <w:r>
+        <w:rPr>
+          <w:rStyle w:val="CommentTok"/>
+        </w:rPr>
+        <w:t xml:space="preserve">#&gt; lowest 0.1216 -0.6037</w:t>
+      </w:r>
+    </w:p>
+    <w:p>
+      <w:pPr>
+        <w:pStyle w:val="Heading3"/>
+      </w:pPr>
+      <w:r>
+        <w:t xml:space="preserve">Python</w:t>
+      </w:r>
+    </w:p>
+    <w:p>
+      <w:pPr>
+        <w:pStyle w:val="SourceCode"/>
+      </w:pPr>
+      <w:r>
+        <w:rPr>
+          <w:rStyle w:val="NormalTok"/>
+        </w:rPr>
+        <w:t xml:space="preserve">s_mo, n_mo </w:t>
+      </w:r>
+      <w:r>
+        <w:rPr>
+          <w:rStyle w:val="OperatorTok"/>
+        </w:rPr>
+        <w:t xml:space="preserve">=</w:t>
+      </w:r>
+      <w:r>
+        <w:rPr>
+          <w:rStyle w:val="NormalTok"/>
+        </w:rPr>
+        <w:t xml:space="preserve"> </w:t>
+      </w:r>
+      <w:r>
+        <w:rPr>
+          <w:rStyle w:val="FloatTok"/>
+        </w:rPr>
+        <w:t xml:space="preserve">0.1</w:t>
+      </w:r>
+      <w:r>
+        <w:rPr>
+          <w:rStyle w:val="NormalTok"/>
+        </w:rPr>
+        <w:t xml:space="preserve">, </w:t>
+      </w:r>
+      <w:r>
+        <w:rPr>
+          <w:rStyle w:val="DecValTok"/>
+        </w:rPr>
+        <w:t xml:space="preserve">20</w:t>
+      </w:r>
+      <w:r>
+        <w:br/>
+      </w:r>
+      <w:r>
+        <w:rPr>
+          <w:rStyle w:val="ControlFlowTok"/>
+        </w:rPr>
+        <w:t xml:space="preserve">for</w:t>
+      </w:r>
+      <w:r>
+        <w:rPr>
+          <w:rStyle w:val="NormalTok"/>
+        </w:rPr>
+        <w:t xml:space="preserve"> beta_mo </w:t>
+      </w:r>
+      <w:r>
+        <w:rPr>
+          <w:rStyle w:val="KeywordTok"/>
+        </w:rPr>
+        <w:t xml:space="preserve">in</w:t>
+      </w:r>
+      <w:r>
+        <w:rPr>
+          <w:rStyle w:val="NormalTok"/>
+        </w:rPr>
+        <w:t xml:space="preserve"> (</w:t>
+      </w:r>
+      <w:r>
+        <w:rPr>
+          <w:rStyle w:val="FloatTok"/>
+        </w:rPr>
+        <w:t xml:space="preserve">0.0</w:t>
+      </w:r>
+      <w:r>
+        <w:rPr>
+          <w:rStyle w:val="NormalTok"/>
+        </w:rPr>
+        <w:t xml:space="preserve">, </w:t>
+      </w:r>
+      <w:r>
+        <w:rPr>
+          <w:rStyle w:val="FloatTok"/>
+        </w:rPr>
+        <w:t xml:space="preserve">0.9</w:t>
+      </w:r>
+      <w:r>
+        <w:rPr>
+          <w:rStyle w:val="NormalTok"/>
+        </w:rPr>
+        <w:t xml:space="preserve">):</w:t>
+      </w:r>
+      <w:r>
+        <w:br/>
+      </w:r>
+      <w:r>
+        <w:rPr>
+          <w:rStyle w:val="NormalTok"/>
+        </w:rPr>
+        <w:t xml:space="preserve">    x_mo, v_mo, path_mo </w:t>
+      </w:r>
+      <w:r>
+        <w:rPr>
+          <w:rStyle w:val="OperatorTok"/>
+        </w:rPr>
+        <w:t xml:space="preserve">=</w:t>
+      </w:r>
+      <w:r>
+        <w:rPr>
+          <w:rStyle w:val="NormalTok"/>
+        </w:rPr>
+        <w:t xml:space="preserve"> </w:t>
+      </w:r>
+      <w:r>
+        <w:rPr>
+          <w:rStyle w:val="FloatTok"/>
+        </w:rPr>
+        <w:t xml:space="preserve">1.0</w:t>
+      </w:r>
+      <w:r>
+        <w:rPr>
+          <w:rStyle w:val="NormalTok"/>
+        </w:rPr>
+        <w:t xml:space="preserve">, </w:t>
+      </w:r>
+      <w:r>
+        <w:rPr>
+          <w:rStyle w:val="FloatTok"/>
+        </w:rPr>
+        <w:t xml:space="preserve">0.0</w:t>
+      </w:r>
+      <w:r>
+        <w:rPr>
+          <w:rStyle w:val="NormalTok"/>
+        </w:rPr>
+        <w:t xml:space="preserve">, []</w:t>
+      </w:r>
+      <w:r>
+        <w:br/>
+      </w:r>
+      <w:r>
+        <w:rPr>
+          <w:rStyle w:val="NormalTok"/>
+        </w:rPr>
+        <w:t xml:space="preserve">    </w:t>
+      </w:r>
+      <w:r>
+        <w:rPr>
+          <w:rStyle w:val="ControlFlowTok"/>
+        </w:rPr>
+        <w:t xml:space="preserve">for</w:t>
+      </w:r>
+      <w:r>
+        <w:rPr>
+          <w:rStyle w:val="NormalTok"/>
+        </w:rPr>
+        <w:t xml:space="preserve"> _ </w:t>
+      </w:r>
+      <w:r>
+        <w:rPr>
+          <w:rStyle w:val="KeywordTok"/>
+        </w:rPr>
+        <w:t xml:space="preserve">in</w:t>
+      </w:r>
+      <w:r>
+        <w:rPr>
+          <w:rStyle w:val="NormalTok"/>
+        </w:rPr>
+        <w:t xml:space="preserve"> </w:t>
+      </w:r>
+      <w:r>
+        <w:rPr>
+          <w:rStyle w:val="BuiltInTok"/>
+        </w:rPr>
+        <w:t xml:space="preserve">range</w:t>
+      </w:r>
+      <w:r>
+        <w:rPr>
+          <w:rStyle w:val="NormalTok"/>
+        </w:rPr>
+        <w:t xml:space="preserve">(n_mo):</w:t>
+      </w:r>
+      <w:r>
+        <w:br/>
+      </w:r>
+      <w:r>
+        <w:rPr>
+          <w:rStyle w:val="NormalTok"/>
+        </w:rPr>
+        <w:t xml:space="preserve">        v_mo </w:t>
+      </w:r>
+      <w:r>
+        <w:rPr>
+          <w:rStyle w:val="OperatorTok"/>
+        </w:rPr>
+        <w:t xml:space="preserve">=</w:t>
+      </w:r>
+      <w:r>
+        <w:rPr>
+          <w:rStyle w:val="NormalTok"/>
+        </w:rPr>
+        <w:t xml:space="preserve"> beta_mo </w:t>
+      </w:r>
+      <w:r>
+        <w:rPr>
+          <w:rStyle w:val="OperatorTok"/>
+        </w:rPr>
+        <w:t xml:space="preserve">*</w:t>
+      </w:r>
+      <w:r>
+        <w:rPr>
+          <w:rStyle w:val="NormalTok"/>
+        </w:rPr>
+        <w:t xml:space="preserve"> v_mo </w:t>
+      </w:r>
+      <w:r>
+        <w:rPr>
+          <w:rStyle w:val="OperatorTok"/>
+        </w:rPr>
+        <w:t xml:space="preserve">+</w:t>
+      </w:r>
+      <w:r>
+        <w:rPr>
+          <w:rStyle w:val="NormalTok"/>
+        </w:rPr>
+        <w:t xml:space="preserve"> x_mo</w:t>
+      </w:r>
+      <w:r>
+        <w:br/>
+      </w:r>
+      <w:r>
+        <w:rPr>
+          <w:rStyle w:val="NormalTok"/>
+        </w:rPr>
+        <w:t xml:space="preserve">        x_mo </w:t>
+      </w:r>
+      <w:r>
+        <w:rPr>
+          <w:rStyle w:val="OperatorTok"/>
+        </w:rPr>
+        <w:t xml:space="preserve">=</w:t>
+      </w:r>
+      <w:r>
+        <w:rPr>
+          <w:rStyle w:val="NormalTok"/>
+        </w:rPr>
+        <w:t xml:space="preserve"> x_mo </w:t>
+      </w:r>
+      <w:r>
+        <w:rPr>
+          <w:rStyle w:val="OperatorTok"/>
+        </w:rPr>
+        <w:t xml:space="preserve">-</w:t>
+      </w:r>
+      <w:r>
+        <w:rPr>
+          <w:rStyle w:val="NormalTok"/>
+        </w:rPr>
+        <w:t xml:space="preserve"> s_mo </w:t>
+      </w:r>
+      <w:r>
+        <w:rPr>
+          <w:rStyle w:val="OperatorTok"/>
+        </w:rPr>
+        <w:t xml:space="preserve">*</w:t>
+      </w:r>
+      <w:r>
+        <w:rPr>
+          <w:rStyle w:val="NormalTok"/>
+        </w:rPr>
+        <w:t xml:space="preserve"> v_mo</w:t>
+      </w:r>
+      <w:r>
+        <w:br/>
+      </w:r>
+      <w:r>
+        <w:rPr>
+          <w:rStyle w:val="NormalTok"/>
+        </w:rPr>
+        <w:t xml:space="preserve">        path_mo.append(x_mo)</w:t>
+      </w:r>
+      <w:r>
+        <w:br/>
+      </w:r>
+      <w:r>
+        <w:rPr>
+          <w:rStyle w:val="NormalTok"/>
+        </w:rPr>
+        <w:t xml:space="preserve">    </w:t>
+      </w:r>
+      <w:r>
+        <w:rPr>
+          <w:rStyle w:val="BuiltInTok"/>
+        </w:rPr>
+        <w:t xml:space="preserve">print</w:t>
+      </w:r>
+      <w:r>
+        <w:rPr>
+          <w:rStyle w:val="NormalTok"/>
+        </w:rPr>
+        <w:t xml:space="preserve">(beta_mo, </w:t>
+      </w:r>
+      <w:r>
+        <w:rPr>
+          <w:rStyle w:val="BuiltInTok"/>
+        </w:rPr>
+        <w:t xml:space="preserve">round</w:t>
+      </w:r>
+      <w:r>
+        <w:rPr>
+          <w:rStyle w:val="NormalTok"/>
+        </w:rPr>
+        <w:t xml:space="preserve">(path_mo[</w:t>
+      </w:r>
+      <w:r>
+        <w:rPr>
+          <w:rStyle w:val="OperatorTok"/>
+        </w:rPr>
+        <w:t xml:space="preserve">-</w:t>
+      </w:r>
+      <w:r>
+        <w:rPr>
+          <w:rStyle w:val="DecValTok"/>
+        </w:rPr>
+        <w:t xml:space="preserve">1</w:t>
+      </w:r>
+      <w:r>
+        <w:rPr>
+          <w:rStyle w:val="NormalTok"/>
+        </w:rPr>
+        <w:t xml:space="preserve">], </w:t>
+      </w:r>
+      <w:r>
+        <w:rPr>
+          <w:rStyle w:val="DecValTok"/>
+        </w:rPr>
+        <w:t xml:space="preserve">4</w:t>
+      </w:r>
+      <w:r>
+        <w:rPr>
+          <w:rStyle w:val="NormalTok"/>
+        </w:rPr>
+        <w:t xml:space="preserve">), </w:t>
+      </w:r>
+      <w:r>
+        <w:rPr>
+          <w:rStyle w:val="BuiltInTok"/>
+        </w:rPr>
+        <w:t xml:space="preserve">round</w:t>
+      </w:r>
+      <w:r>
+        <w:rPr>
+          <w:rStyle w:val="NormalTok"/>
+        </w:rPr>
+        <w:t xml:space="preserve">(</w:t>
+      </w:r>
+      <w:r>
+        <w:rPr>
+          <w:rStyle w:val="BuiltInTok"/>
+        </w:rPr>
+        <w:t xml:space="preserve">min</w:t>
+      </w:r>
+      <w:r>
+        <w:rPr>
+          <w:rStyle w:val="NormalTok"/>
+        </w:rPr>
+        <w:t xml:space="preserve">(path_mo), </w:t>
+      </w:r>
+      <w:r>
+        <w:rPr>
+          <w:rStyle w:val="DecValTok"/>
+        </w:rPr>
+        <w:t xml:space="preserve">4</w:t>
+      </w:r>
+      <w:r>
+        <w:rPr>
+          <w:rStyle w:val="NormalTok"/>
+        </w:rPr>
+        <w:t xml:space="preserve">))</w:t>
+      </w:r>
+      <w:r>
+        <w:rPr>
+          <w:rStyle w:val="OperatorTok"/>
+        </w:rPr>
+        <w:t xml:space="preserve">;</w:t>
+      </w:r>
+      <w:r>
+        <w:br/>
+      </w:r>
+      <w:r>
+        <w:rPr>
+          <w:rStyle w:val="CommentTok"/>
+        </w:rPr>
+        <w:t xml:space="preserve">#&gt; 0.0 0.1216 0.1216</w:t>
+      </w:r>
+      <w:r>
+        <w:br/>
+      </w:r>
+      <w:r>
+        <w:rPr>
+          <w:rStyle w:val="CommentTok"/>
+        </w:rPr>
+        <w:t xml:space="preserve">#&gt; 0.9 0.3447 -0.6037</w:t>
+      </w:r>
+    </w:p>
+    <w:p>
+      <w:pPr>
+        <w:pStyle w:val="FirstParagraph"/>
+      </w:pPr>
+      <w:r>
+        <w:t xml:space="preserve">After</w:t>
+      </w:r>
+      <w:r>
+        <w:t xml:space="preserve"> </w:t>
+      </w:r>
+      <m:oMath>
+        <m:r>
+          <m:t>20</m:t>
+        </m:r>
+      </m:oMath>
+      <w:r>
+        <w:t xml:space="preserve"> </w:t>
+      </w:r>
+      <w:r>
+        <w:t xml:space="preserve">updates, plain descent has reached 0.122 and</w:t>
+      </w:r>
+      <w:r>
+        <w:t xml:space="preserve"> </w:t>
+      </w:r>
+      <w:hyperlink w:anchor="def-momentum">
+        <w:r>
+          <w:rPr>
+            <w:rStyle w:val="Hyperlink"/>
+          </w:rPr>
+          <w:t xml:space="preserve">momentum</w:t>
+        </w:r>
+      </w:hyperlink>
+      <w:r>
+        <w:t xml:space="preserve"> </w:t>
+      </w:r>
+      <w:r>
+        <w:t xml:space="preserve">0.345.</w:t>
+      </w:r>
+      <w:r>
+        <w:t xml:space="preserve"> </w:t>
+      </w:r>
+      <w:r>
+        <w:t xml:space="preserve">Momentum overshoots the</w:t>
+      </w:r>
+      <w:r>
+        <w:t xml:space="preserve"> </w:t>
+      </w:r>
+      <w:hyperlink r:id="rId97">
+        <w:r>
+          <w:rPr>
+            <w:rStyle w:val="Hyperlink"/>
+          </w:rPr>
+          <w:t xml:space="preserve">minimizer</w:t>
+        </w:r>
+      </w:hyperlink>
+      <w:r>
+        <w:t xml:space="preserve"> </w:t>
+      </w:r>
+      <m:oMath>
+        <m:r>
+          <m:t>0</m:t>
+        </m:r>
+      </m:oMath>
+      <w:r>
+        <w:t xml:space="preserve">, down to -0.604 at update 9, and then swings back.</w:t>
+      </w:r>
+      <w:r>
+        <w:t xml:space="preserve"> </w:t>
+      </w:r>
+      <w:r>
+        <w:t xml:space="preserve">In this run, with a small</w:t>
+      </w:r>
+      <w:r>
+        <w:t xml:space="preserve"> </w:t>
+      </w:r>
+      <w:hyperlink w:anchor="def-gradient-descent">
+        <w:r>
+          <w:rPr>
+            <w:rStyle w:val="Hyperlink"/>
+          </w:rPr>
+          <w:t xml:space="preserve">step length</w:t>
+        </w:r>
+      </w:hyperlink>
+      <w:r>
+        <w:t xml:space="preserve">, the swing leaves momentum behind plain descent after</w:t>
+      </w:r>
+      <w:r>
+        <w:t xml:space="preserve"> </w:t>
+      </w:r>
+      <m:oMath>
+        <m:r>
+          <m:t>20</m:t>
+        </m:r>
+      </m:oMath>
+      <w:r>
+        <w:t xml:space="preserve"> </w:t>
+      </w:r>
+      <w:r>
+        <w:t xml:space="preserve">updates.</w:t>
+      </w:r>
+    </w:p>
+    <w:bookmarkEnd w:id="135"/>
+    <w:bookmarkStart w:id="146" w:name="refs"/>
+    <w:bookmarkStart w:id="137" w:name="ref-wikipedia_gradient_descent"/>
     <w:p>
       <w:pPr>
         <w:pStyle w:val="Bibliography"/>
@@ -37431,7 +40478,7 @@
       <w:r>
         <w:t xml:space="preserve"> </w:t>
       </w:r>
-      <w:hyperlink r:id="rId132">
+      <w:hyperlink r:id="rId136">
         <w:r>
           <w:rPr>
             <w:rStyle w:val="Hyperlink"/>
@@ -37440,8 +40487,8 @@
         </w:r>
       </w:hyperlink>
     </w:p>
-    <w:bookmarkEnd w:id="133"/>
-    <w:bookmarkStart w:id="135" w:name="ref-wikipedia_line_search"/>
+    <w:bookmarkEnd w:id="137"/>
+    <w:bookmarkStart w:id="139" w:name="ref-wikipedia_line_search"/>
     <w:p>
       <w:pPr>
         <w:pStyle w:val="Bibliography"/>
@@ -37488,7 +40535,7 @@
       <w:r>
         <w:t xml:space="preserve"> </w:t>
       </w:r>
-      <w:hyperlink r:id="rId134">
+      <w:hyperlink r:id="rId138">
         <w:r>
           <w:rPr>
             <w:rStyle w:val="Hyperlink"/>
@@ -37497,8 +40544,8 @@
         </w:r>
       </w:hyperlink>
     </w:p>
-    <w:bookmarkEnd w:id="135"/>
-    <w:bookmarkStart w:id="137" w:name="ref-wikipedia_rosenbrock_function"/>
+    <w:bookmarkEnd w:id="139"/>
+    <w:bookmarkStart w:id="141" w:name="ref-wikipedia_rosenbrock_function"/>
     <w:p>
       <w:pPr>
         <w:pStyle w:val="Bibliography"/>
@@ -37545,7 +40592,7 @@
       <w:r>
         <w:t xml:space="preserve"> </w:t>
       </w:r>
-      <w:hyperlink r:id="rId136">
+      <w:hyperlink r:id="rId140">
         <w:r>
           <w:rPr>
             <w:rStyle w:val="Hyperlink"/>
@@ -37554,8 +40601,8 @@
         </w:r>
       </w:hyperlink>
     </w:p>
-    <w:bookmarkEnd w:id="137"/>
-    <w:bookmarkStart w:id="139" w:name="ref-wikipedia_attractor"/>
+    <w:bookmarkEnd w:id="141"/>
+    <w:bookmarkStart w:id="143" w:name="ref-wikipedia_attractor"/>
     <w:p>
       <w:pPr>
         <w:pStyle w:val="Bibliography"/>
@@ -37602,7 +40649,7 @@
       <w:r>
         <w:t xml:space="preserve"> </w:t>
       </w:r>
-      <w:hyperlink r:id="rId138">
+      <w:hyperlink r:id="rId142">
         <w:r>
           <w:rPr>
             <w:rStyle w:val="Hyperlink"/>
@@ -37611,8 +40658,8 @@
         </w:r>
       </w:hyperlink>
     </w:p>
-    <w:bookmarkEnd w:id="139"/>
-    <w:bookmarkStart w:id="141" w:name="ref-wikipedia_backtracking_line_search"/>
+    <w:bookmarkEnd w:id="143"/>
+    <w:bookmarkStart w:id="145" w:name="ref-wikipedia_backtracking_line_search"/>
     <w:p>
       <w:pPr>
         <w:pStyle w:val="Bibliography"/>
@@ -37659,7 +40706,7 @@
       <w:r>
         <w:t xml:space="preserve"> </w:t>
       </w:r>
-      <w:hyperlink r:id="rId140">
+      <w:hyperlink r:id="rId144">
         <w:r>
           <w:rPr>
             <w:rStyle w:val="Hyperlink"/>
@@ -37668,9 +40715,9 @@
         </w:r>
       </w:hyperlink>
     </w:p>
-    <w:bookmarkEnd w:id="141"/>
-    <w:bookmarkEnd w:id="142"/>
-    <w:bookmarkEnd w:id="143"/>
+    <w:bookmarkEnd w:id="145"/>
+    <w:bookmarkEnd w:id="146"/>
+    <w:bookmarkEnd w:id="147"/>
     <w:sectPr>
       <w:footnotePr>
         <w:numRestart w:val="eachSect"/>

</xml_diff>